<commit_message>
SWA 6.8: katalog = 12 obowiazujacych wzorow z folderu uzytkownika; sekcje per-projekt (bez Kursow zawodowych); A-01/B-02/G-04 odtworzone z aktualnych wzorow + A-02/C-01 dodane
</commit_message>
<xml_diff>
--- a/public/wzory/SWA_A-01_Pakiet_zgloszeniowy_uczestnika_szablon.docx
+++ b/public/wzory/SWA_A-01_Pakiet_zgloszeniowy_uczestnika_szablon.docx
@@ -4,35 +4,35 @@
   <w:body>
     <w:p>
       <w:pPr>
-        <w:spacing w:after="60" w:before="0"/>
+        <w:spacing w:after="60"/>
         <w:jc w:val="center"/>
       </w:pPr>
       <w:r>
         <w:rPr>
           <w:rFonts w:ascii="Arial" w:hAnsi="Arial" w:cs="Arial"/>
+          <w:b/>
+          <w:bCs/>
           <w:sz w:val="28"/>
           <w:szCs w:val="28"/>
-          <w:b/>
-          <w:bCs/>
-        </w:rPr>
-        <w:t xml:space="preserve">PAKIET ZGŁOSZENIOWY UCZESTNIKA/UCZESTNICZKI PROJEKTU</w:t>
-      </w:r>
-    </w:p>
-    <w:p>
-      <w:pPr>
-        <w:spacing w:after="60" w:before="0"/>
+        </w:rPr>
+        <w:t>PAKIET ZGŁOSZENIOWY UCZESTNIKA/UCZESTNICZKI PROJEKTU</w:t>
+      </w:r>
+    </w:p>
+    <w:p>
+      <w:pPr>
+        <w:spacing w:after="60"/>
         <w:jc w:val="center"/>
       </w:pPr>
       <w:r>
         <w:rPr>
           <w:rFonts w:ascii="Arial" w:hAnsi="Arial" w:cs="Arial"/>
-          <w:sz w:val="22"/>
-          <w:szCs w:val="22"/>
           <w:b/>
           <w:bCs/>
           <w:color w:val="2F5496"/>
-        </w:rPr>
-        <w:t xml:space="preserve">Formularz SWA/A-01</w:t>
+          <w:sz w:val="22"/>
+          <w:szCs w:val="22"/>
+        </w:rPr>
+        <w:t>Formularz SWA/A-01</w:t>
       </w:r>
     </w:p>
     <w:p>
@@ -42,7 +42,7 @@
     </w:p>
     <w:p>
       <w:pPr>
-        <w:spacing w:after="60" w:before="0"/>
+        <w:spacing w:after="60"/>
       </w:pPr>
       <w:r>
         <w:rPr>
@@ -55,28 +55,28 @@
       <w:r>
         <w:rPr>
           <w:rFonts w:ascii="Arial" w:hAnsi="Arial" w:cs="Arial"/>
+          <w:b/>
+          <w:bCs/>
           <w:sz w:val="18"/>
           <w:szCs w:val="18"/>
-          <w:b/>
-          <w:bCs/>
-        </w:rPr>
-        <w:t xml:space="preserve">formularz zgłoszeniowy, deklarację uczestnictwa, oświadczenia kwalifikacyjne, klauzulę informacyjną RODO, zgodę na przetwarzanie danych osobowych oraz zgodę na wykorzystanie wizerunku.</w:t>
-      </w:r>
-    </w:p>
-    <w:p>
-      <w:pPr>
-        <w:spacing w:after="200" w:before="0"/>
-      </w:pPr>
-      <w:r>
-        <w:rPr>
-          <w:rFonts w:ascii="Arial" w:hAnsi="Arial" w:cs="Arial"/>
-          <w:sz w:val="18"/>
-          <w:szCs w:val="18"/>
+        </w:rPr>
+        <w:t>formularz zgłoszeniowy, deklarację uczestnictwa, oświadczenia kwalifikacyjne, klauzulę informacyjną RODO, zgodę na przetwarzanie danych osobowych oraz zgodę na wykorzystanie wizerunku.</w:t>
+      </w:r>
+    </w:p>
+    <w:p>
+      <w:pPr>
+        <w:spacing w:after="200"/>
+      </w:pPr>
+      <w:r>
+        <w:rPr>
+          <w:rFonts w:ascii="Arial" w:hAnsi="Arial" w:cs="Arial"/>
           <w:b/>
           <w:bCs/>
           <w:color w:val="C00000"/>
-        </w:rPr>
-        <w:t xml:space="preserve">Jeden podpis na końcu dokumentu potwierdza wszystkie zawarte oświadczenia i zgody.</w:t>
+          <w:sz w:val="18"/>
+          <w:szCs w:val="18"/>
+        </w:rPr>
+        <w:t>Jeden podpis na końcu dokumentu potwierdza wszystkie zawarte oświadczenia i zgody.</w:t>
       </w:r>
     </w:p>
     <w:p>
@@ -89,19 +89,18 @@
       <w:r>
         <w:rPr>
           <w:rFonts w:ascii="Arial" w:hAnsi="Arial" w:cs="Arial"/>
-          <w:sz w:val="24"/>
-          <w:szCs w:val="24"/>
           <w:b/>
           <w:bCs/>
           <w:color w:val="2F5496"/>
         </w:rPr>
-        <w:t xml:space="preserve">SEKCJA A: DANE OSOBOWE UCZESTNIKA/UCZESTNICZKI</w:t>
+        <w:t>SEKCJA A: DANE OSOBOWE UCZESTNIKA/UCZESTNICZKI</w:t>
       </w:r>
     </w:p>
     <w:tbl>
       <w:tblPr>
         <w:tblW w:w="9072" w:type="dxa"/>
         <w:tblLayout w:type="fixed"/>
+        <w:tblLook w:val="04A0" w:firstRow="1" w:lastRow="0" w:firstColumn="1" w:lastColumn="0" w:noHBand="0" w:noVBand="1"/>
       </w:tblPr>
       <w:tblGrid>
         <w:gridCol w:w="3000"/>
@@ -129,12 +128,12 @@
             <w:r>
               <w:rPr>
                 <w:rFonts w:ascii="Arial" w:hAnsi="Arial" w:cs="Arial"/>
+                <w:b/>
+                <w:bCs/>
                 <w:sz w:val="20"/>
                 <w:szCs w:val="20"/>
-                <w:b/>
-                <w:bCs/>
               </w:rPr>
-              <w:t xml:space="preserve">Imię (imiona)</w:t>
+              <w:t>Imię (imiona)</w:t>
             </w:r>
           </w:p>
         </w:tc>
@@ -156,11 +155,6 @@
           </w:tcPr>
           <w:p>
             <w:r>
-              <w:rPr>
-                <w:rFonts w:ascii="Arial" w:hAnsi="Arial" w:cs="Arial"/>
-                <w:sz w:val="20"/>
-                <w:szCs w:val="20"/>
-              </w:rPr>
               <w:t>{{imie}}</w:t>
             </w:r>
           </w:p>
@@ -188,12 +182,12 @@
             <w:r>
               <w:rPr>
                 <w:rFonts w:ascii="Arial" w:hAnsi="Arial" w:cs="Arial"/>
+                <w:b/>
+                <w:bCs/>
                 <w:sz w:val="20"/>
                 <w:szCs w:val="20"/>
-                <w:b/>
-                <w:bCs/>
               </w:rPr>
-              <w:t xml:space="preserve">Nazwisko</w:t>
+              <w:t>Nazwisko</w:t>
             </w:r>
           </w:p>
         </w:tc>
@@ -215,11 +209,6 @@
           </w:tcPr>
           <w:p>
             <w:r>
-              <w:rPr>
-                <w:rFonts w:ascii="Arial" w:hAnsi="Arial" w:cs="Arial"/>
-                <w:sz w:val="20"/>
-                <w:szCs w:val="20"/>
-              </w:rPr>
               <w:t>{{nazwisko}}</w:t>
             </w:r>
           </w:p>
@@ -247,12 +236,12 @@
             <w:r>
               <w:rPr>
                 <w:rFonts w:ascii="Arial" w:hAnsi="Arial" w:cs="Arial"/>
+                <w:b/>
+                <w:bCs/>
                 <w:sz w:val="20"/>
                 <w:szCs w:val="20"/>
-                <w:b/>
-                <w:bCs/>
               </w:rPr>
-              <w:t xml:space="preserve">PESEL</w:t>
+              <w:t>PESEL</w:t>
             </w:r>
           </w:p>
         </w:tc>
@@ -274,11 +263,6 @@
           </w:tcPr>
           <w:p>
             <w:r>
-              <w:rPr>
-                <w:rFonts w:ascii="Arial" w:hAnsi="Arial" w:cs="Arial"/>
-                <w:sz w:val="20"/>
-                <w:szCs w:val="20"/>
-              </w:rPr>
               <w:t>{{pesel}}</w:t>
             </w:r>
           </w:p>
@@ -306,12 +290,12 @@
             <w:r>
               <w:rPr>
                 <w:rFonts w:ascii="Arial" w:hAnsi="Arial" w:cs="Arial"/>
+                <w:b/>
+                <w:bCs/>
                 <w:sz w:val="20"/>
                 <w:szCs w:val="20"/>
-                <w:b/>
-                <w:bCs/>
               </w:rPr>
-              <w:t xml:space="preserve">Data urodzenia</w:t>
+              <w:t>Data urodzenia</w:t>
             </w:r>
           </w:p>
         </w:tc>
@@ -333,11 +317,6 @@
           </w:tcPr>
           <w:p>
             <w:r>
-              <w:rPr>
-                <w:rFonts w:ascii="Arial" w:hAnsi="Arial" w:cs="Arial"/>
-                <w:sz w:val="20"/>
-                <w:szCs w:val="20"/>
-              </w:rPr>
               <w:t>{{data_urodzenia}}</w:t>
             </w:r>
           </w:p>
@@ -365,12 +344,12 @@
             <w:r>
               <w:rPr>
                 <w:rFonts w:ascii="Arial" w:hAnsi="Arial" w:cs="Arial"/>
+                <w:b/>
+                <w:bCs/>
                 <w:sz w:val="20"/>
                 <w:szCs w:val="20"/>
-                <w:b/>
-                <w:bCs/>
               </w:rPr>
-              <w:t xml:space="preserve">Płeć</w:t>
+              <w:t>Płeć</w:t>
             </w:r>
           </w:p>
         </w:tc>
@@ -397,7 +376,7 @@
                 <w:sz w:val="20"/>
                 <w:szCs w:val="20"/>
               </w:rPr>
-              <w:t>{{plec}}</w:t>
+              <w:t>☐ Kobieta     ☐ Mężczyzna</w:t>
             </w:r>
           </w:p>
         </w:tc>
@@ -424,12 +403,12 @@
             <w:r>
               <w:rPr>
                 <w:rFonts w:ascii="Arial" w:hAnsi="Arial" w:cs="Arial"/>
+                <w:b/>
+                <w:bCs/>
                 <w:sz w:val="20"/>
                 <w:szCs w:val="20"/>
-                <w:b/>
-                <w:bCs/>
               </w:rPr>
-              <w:t xml:space="preserve">Obywatelstwo</w:t>
+              <w:t>Obywatelstwo</w:t>
             </w:r>
           </w:p>
         </w:tc>
@@ -451,11 +430,6 @@
           </w:tcPr>
           <w:p>
             <w:r>
-              <w:rPr>
-                <w:rFonts w:ascii="Arial" w:hAnsi="Arial" w:cs="Arial"/>
-                <w:sz w:val="20"/>
-                <w:szCs w:val="20"/>
-              </w:rPr>
               <w:t>{{obywatelstwo}}</w:t>
             </w:r>
           </w:p>
@@ -483,12 +457,42 @@
             <w:r>
               <w:rPr>
                 <w:rFonts w:ascii="Arial" w:hAnsi="Arial" w:cs="Arial"/>
+                <w:b/>
+                <w:bCs/>
                 <w:sz w:val="20"/>
                 <w:szCs w:val="20"/>
+              </w:rPr>
+              <w:t>Adres zamieszkania</w:t>
+            </w:r>
+            <w:r>
+              <w:rPr>
+                <w:rFonts w:ascii="Arial" w:hAnsi="Arial" w:cs="Arial"/>
                 <w:b/>
                 <w:bCs/>
+                <w:sz w:val="20"/>
+                <w:szCs w:val="20"/>
               </w:rPr>
-              <w:t xml:space="preserve">Adres zamieszkania</w:t>
+              <w:t>-</w:t>
+            </w:r>
+            <w:r>
+              <w:rPr>
+                <w:rFonts w:ascii="Arial" w:hAnsi="Arial" w:cs="Arial"/>
+                <w:b/>
+                <w:bCs/>
+                <w:sz w:val="20"/>
+                <w:szCs w:val="20"/>
+              </w:rPr>
+              <w:t xml:space="preserve"> </w:t>
+            </w:r>
+            <w:r>
+              <w:rPr>
+                <w:rFonts w:ascii="Arial" w:hAnsi="Arial" w:cs="Arial"/>
+                <w:b/>
+                <w:bCs/>
+                <w:sz w:val="20"/>
+                <w:szCs w:val="20"/>
+              </w:rPr>
+              <w:t>Ulica, nr domu/lokalu</w:t>
             </w:r>
           </w:p>
         </w:tc>
@@ -510,11 +514,6 @@
           </w:tcPr>
           <w:p>
             <w:r>
-              <w:rPr>
-                <w:rFonts w:ascii="Arial" w:hAnsi="Arial" w:cs="Arial"/>
-                <w:sz w:val="20"/>
-                <w:szCs w:val="20"/>
-              </w:rPr>
               <w:t>{{adres}}</w:t>
             </w:r>
           </w:p>
@@ -542,12 +541,12 @@
             <w:r>
               <w:rPr>
                 <w:rFonts w:ascii="Arial" w:hAnsi="Arial" w:cs="Arial"/>
+                <w:b/>
+                <w:bCs/>
                 <w:sz w:val="20"/>
                 <w:szCs w:val="20"/>
-                <w:b/>
-                <w:bCs/>
               </w:rPr>
-              <w:t xml:space="preserve">Ulica, nr domu/lokalu</w:t>
+              <w:t>Kod pocztowy, miejscowość</w:t>
             </w:r>
           </w:p>
         </w:tc>
@@ -569,70 +568,6 @@
           </w:tcPr>
           <w:p>
             <w:r>
-              <w:rPr>
-                <w:rFonts w:ascii="Arial" w:hAnsi="Arial" w:cs="Arial"/>
-                <w:sz w:val="20"/>
-                <w:szCs w:val="20"/>
-              </w:rPr>
-              <w:t xml:space="preserve"/>
-            </w:r>
-          </w:p>
-        </w:tc>
-      </w:tr>
-      <w:tr>
-        <w:tc>
-          <w:tcPr>
-            <w:tcW w:w="3000" w:type="dxa"/>
-            <w:tcBorders>
-              <w:top w:val="single" w:sz="4" w:space="0" w:color="999999"/>
-              <w:left w:val="single" w:sz="4" w:space="0" w:color="999999"/>
-              <w:bottom w:val="single" w:sz="4" w:space="0" w:color="999999"/>
-              <w:right w:val="single" w:sz="4" w:space="0" w:color="999999"/>
-            </w:tcBorders>
-            <w:shd w:val="clear" w:color="auto" w:fill="F2F2F2"/>
-            <w:tcMar>
-              <w:top w:w="60" w:type="dxa"/>
-              <w:left w:w="100" w:type="dxa"/>
-              <w:bottom w:w="60" w:type="dxa"/>
-              <w:right w:w="100" w:type="dxa"/>
-            </w:tcMar>
-          </w:tcPr>
-          <w:p>
-            <w:r>
-              <w:rPr>
-                <w:rFonts w:ascii="Arial" w:hAnsi="Arial" w:cs="Arial"/>
-                <w:sz w:val="20"/>
-                <w:szCs w:val="20"/>
-                <w:b/>
-                <w:bCs/>
-              </w:rPr>
-              <w:t xml:space="preserve">Kod pocztowy, miejscowość</w:t>
-            </w:r>
-          </w:p>
-        </w:tc>
-        <w:tc>
-          <w:tcPr>
-            <w:tcW w:w="6072" w:type="dxa"/>
-            <w:tcBorders>
-              <w:top w:val="single" w:sz="4" w:space="0" w:color="999999"/>
-              <w:left w:val="single" w:sz="4" w:space="0" w:color="999999"/>
-              <w:bottom w:val="single" w:sz="4" w:space="0" w:color="999999"/>
-              <w:right w:val="single" w:sz="4" w:space="0" w:color="999999"/>
-            </w:tcBorders>
-            <w:tcMar>
-              <w:top w:w="60" w:type="dxa"/>
-              <w:left w:w="100" w:type="dxa"/>
-              <w:bottom w:w="60" w:type="dxa"/>
-              <w:right w:w="100" w:type="dxa"/>
-            </w:tcMar>
-          </w:tcPr>
-          <w:p>
-            <w:r>
-              <w:rPr>
-                <w:rFonts w:ascii="Arial" w:hAnsi="Arial" w:cs="Arial"/>
-                <w:sz w:val="20"/>
-                <w:szCs w:val="20"/>
-              </w:rPr>
               <w:t>{{kod_pocztowy}} {{miejscowosc}}</w:t>
             </w:r>
           </w:p>
@@ -660,12 +595,22 @@
             <w:r>
               <w:rPr>
                 <w:rFonts w:ascii="Arial" w:hAnsi="Arial" w:cs="Arial"/>
+                <w:b/>
+                <w:bCs/>
                 <w:sz w:val="20"/>
                 <w:szCs w:val="20"/>
+              </w:rPr>
+              <w:t>Powiat</w:t>
+            </w:r>
+            <w:r>
+              <w:rPr>
+                <w:rFonts w:ascii="Arial" w:hAnsi="Arial" w:cs="Arial"/>
                 <w:b/>
                 <w:bCs/>
+                <w:sz w:val="20"/>
+                <w:szCs w:val="20"/>
               </w:rPr>
-              <w:t xml:space="preserve">Powiat</w:t>
+              <w:t xml:space="preserve">/Gmina </w:t>
             </w:r>
           </w:p>
         </w:tc>
@@ -687,12 +632,7 @@
           </w:tcPr>
           <w:p>
             <w:r>
-              <w:rPr>
-                <w:rFonts w:ascii="Arial" w:hAnsi="Arial" w:cs="Arial"/>
-                <w:sz w:val="20"/>
-                <w:szCs w:val="20"/>
-              </w:rPr>
-              <w:t>{{powiat}}</w:t>
+              <w:t>{{powiat}} / {{gmina}}</w:t>
             </w:r>
           </w:p>
         </w:tc>
@@ -719,12 +659,12 @@
             <w:r>
               <w:rPr>
                 <w:rFonts w:ascii="Arial" w:hAnsi="Arial" w:cs="Arial"/>
+                <w:b/>
+                <w:bCs/>
                 <w:sz w:val="20"/>
                 <w:szCs w:val="20"/>
-                <w:b/>
-                <w:bCs/>
               </w:rPr>
-              <w:t xml:space="preserve">Województwo</w:t>
+              <w:t>Województwo</w:t>
             </w:r>
           </w:p>
         </w:tc>
@@ -746,11 +686,6 @@
           </w:tcPr>
           <w:p>
             <w:r>
-              <w:rPr>
-                <w:rFonts w:ascii="Arial" w:hAnsi="Arial" w:cs="Arial"/>
-                <w:sz w:val="20"/>
-                <w:szCs w:val="20"/>
-              </w:rPr>
               <w:t>{{wojewodztwo}}</w:t>
             </w:r>
           </w:p>
@@ -778,12 +713,12 @@
             <w:r>
               <w:rPr>
                 <w:rFonts w:ascii="Arial" w:hAnsi="Arial" w:cs="Arial"/>
+                <w:b/>
+                <w:bCs/>
                 <w:sz w:val="20"/>
                 <w:szCs w:val="20"/>
-                <w:b/>
-                <w:bCs/>
               </w:rPr>
-              <w:t xml:space="preserve">Obszar wg DEGURBA</w:t>
+              <w:t>Obszar wg DEGURBA</w:t>
             </w:r>
           </w:p>
         </w:tc>
@@ -810,7 +745,7 @@
                 <w:sz w:val="20"/>
                 <w:szCs w:val="20"/>
               </w:rPr>
-              <w:t>{{degurba}}</w:t>
+              <w:t>☐ Miasto     ☐ Wieś / teren wiejski</w:t>
             </w:r>
           </w:p>
         </w:tc>
@@ -837,12 +772,12 @@
             <w:r>
               <w:rPr>
                 <w:rFonts w:ascii="Arial" w:hAnsi="Arial" w:cs="Arial"/>
+                <w:b/>
+                <w:bCs/>
                 <w:sz w:val="20"/>
                 <w:szCs w:val="20"/>
-                <w:b/>
-                <w:bCs/>
               </w:rPr>
-              <w:t xml:space="preserve">Telefon kontaktowy</w:t>
+              <w:t>Telefon kontaktowy</w:t>
             </w:r>
           </w:p>
         </w:tc>
@@ -864,11 +799,6 @@
           </w:tcPr>
           <w:p>
             <w:r>
-              <w:rPr>
-                <w:rFonts w:ascii="Arial" w:hAnsi="Arial" w:cs="Arial"/>
-                <w:sz w:val="20"/>
-                <w:szCs w:val="20"/>
-              </w:rPr>
               <w:t>{{telefon}}</w:t>
             </w:r>
           </w:p>
@@ -896,12 +826,12 @@
             <w:r>
               <w:rPr>
                 <w:rFonts w:ascii="Arial" w:hAnsi="Arial" w:cs="Arial"/>
+                <w:b/>
+                <w:bCs/>
                 <w:sz w:val="20"/>
                 <w:szCs w:val="20"/>
-                <w:b/>
-                <w:bCs/>
               </w:rPr>
-              <w:t xml:space="preserve">Adres e-mail</w:t>
+              <w:t>Adres e-mail</w:t>
             </w:r>
           </w:p>
         </w:tc>
@@ -923,11 +853,6 @@
           </w:tcPr>
           <w:p>
             <w:r>
-              <w:rPr>
-                <w:rFonts w:ascii="Arial" w:hAnsi="Arial" w:cs="Arial"/>
-                <w:sz w:val="20"/>
-                <w:szCs w:val="20"/>
-              </w:rPr>
               <w:t>{{email}}</w:t>
             </w:r>
           </w:p>
@@ -944,133 +869,91 @@
       <w:r>
         <w:rPr>
           <w:rFonts w:ascii="Arial" w:hAnsi="Arial" w:cs="Arial"/>
-          <w:sz w:val="24"/>
-          <w:szCs w:val="24"/>
           <w:b/>
           <w:bCs/>
           <w:color w:val="2F5496"/>
         </w:rPr>
-        <w:t xml:space="preserve">SEKCJA B: STATUS SPOŁECZNO-ZAWODOWY</w:t>
-      </w:r>
-    </w:p>
-    <w:p>
-      <w:pPr>
-        <w:spacing w:after="100" w:before="0"/>
-      </w:pPr>
-      <w:r>
-        <w:rPr>
-          <w:rFonts w:ascii="Arial" w:hAnsi="Arial" w:cs="Arial"/>
-          <w:sz w:val="20"/>
-          <w:szCs w:val="20"/>
+        <w:t>SEKCJA B: STATUS SPOŁECZNO-ZAWODOWY</w:t>
+      </w:r>
+    </w:p>
+    <w:p>
+      <w:pPr>
+        <w:spacing w:after="100"/>
+      </w:pPr>
+      <w:r>
+        <w:rPr>
+          <w:rFonts w:ascii="Arial" w:hAnsi="Arial" w:cs="Arial"/>
           <w:b/>
           <w:bCs/>
-        </w:rPr>
-        <w:t xml:space="preserve">Status na rynku pracy (proszę zaznaczyć):</w:t>
-      </w:r>
-    </w:p>
-    <w:p>
-      <w:pPr>
-        <w:spacing w:after="60" w:before="0"/>
-      </w:pPr>
-      <w:r>
-        <w:rPr>
-          <w:rFonts w:ascii="Arial" w:hAnsi="Arial" w:cs="Arial"/>
-          <w:sz w:val="20"/>
-          <w:szCs w:val="20"/>
-        </w:rPr>
-        <w:t xml:space="preserve">☐  </w:t>
-      </w:r>
-      <w:r>
-        <w:rPr>
-          <w:rFonts w:ascii="Arial" w:hAnsi="Arial" w:cs="Arial"/>
-          <w:sz w:val="20"/>
-          <w:szCs w:val="20"/>
-        </w:rPr>
-        <w:t xml:space="preserve">Osoba pracująca</w:t>
-      </w:r>
-    </w:p>
-    <w:p>
-      <w:pPr>
-        <w:spacing w:after="60" w:before="0"/>
-      </w:pPr>
-      <w:r>
-        <w:rPr>
-          <w:rFonts w:ascii="Arial" w:hAnsi="Arial" w:cs="Arial"/>
-          <w:sz w:val="20"/>
-          <w:szCs w:val="20"/>
-        </w:rPr>
-        <w:t xml:space="preserve">☐  </w:t>
-      </w:r>
-      <w:r>
-        <w:rPr>
-          <w:rFonts w:ascii="Arial" w:hAnsi="Arial" w:cs="Arial"/>
-          <w:sz w:val="20"/>
-          <w:szCs w:val="20"/>
-        </w:rPr>
-        <w:t xml:space="preserve">Osoba bezrobotna (zarejestrowana w PUP)</w:t>
-      </w:r>
-    </w:p>
-    <w:p>
-      <w:pPr>
-        <w:spacing w:after="60" w:before="0"/>
-      </w:pPr>
-      <w:r>
-        <w:rPr>
-          <w:rFonts w:ascii="Arial" w:hAnsi="Arial" w:cs="Arial"/>
-          <w:sz w:val="20"/>
-          <w:szCs w:val="20"/>
-        </w:rPr>
-        <w:t xml:space="preserve">☐  </w:t>
-      </w:r>
-      <w:r>
-        <w:rPr>
-          <w:rFonts w:ascii="Arial" w:hAnsi="Arial" w:cs="Arial"/>
-          <w:sz w:val="20"/>
-          <w:szCs w:val="20"/>
-        </w:rPr>
-        <w:t xml:space="preserve">Osoba bezrobotna (niezarejestrowana)</w:t>
-      </w:r>
-    </w:p>
-    <w:p>
-      <w:pPr>
-        <w:spacing w:after="60" w:before="0"/>
-      </w:pPr>
-      <w:r>
-        <w:rPr>
-          <w:rFonts w:ascii="Arial" w:hAnsi="Arial" w:cs="Arial"/>
-          <w:sz w:val="20"/>
-          <w:szCs w:val="20"/>
-        </w:rPr>
-        <w:t xml:space="preserve">☐  </w:t>
-      </w:r>
-      <w:r>
-        <w:rPr>
-          <w:rFonts w:ascii="Arial" w:hAnsi="Arial" w:cs="Arial"/>
-          <w:sz w:val="20"/>
-          <w:szCs w:val="20"/>
-        </w:rPr>
-        <w:t xml:space="preserve">Osoba bierna zawodowo</w:t>
-      </w:r>
-    </w:p>
-    <w:p>
-      <w:pPr>
-        <w:spacing w:after="60" w:before="0"/>
-      </w:pPr>
-      <w:r>
-        <w:rPr>
-          <w:rFonts w:ascii="Arial" w:hAnsi="Arial" w:cs="Arial"/>
-          <w:sz w:val="20"/>
-          <w:szCs w:val="20"/>
-        </w:rPr>
-        <w:t xml:space="preserve">☐  </w:t>
-      </w:r>
-      <w:r>
-        <w:rPr>
-          <w:rFonts w:ascii="Arial" w:hAnsi="Arial" w:cs="Arial"/>
-          <w:sz w:val="20"/>
-          <w:szCs w:val="20"/>
-        </w:rPr>
-        <w:t xml:space="preserve">Emeryt/rencista</w:t>
+          <w:sz w:val="20"/>
+          <w:szCs w:val="20"/>
+        </w:rPr>
+        <w:t>Status na rynku pracy (proszę zaznaczyć):</w:t>
+      </w:r>
+    </w:p>
+    <w:p>
+      <w:pPr>
+        <w:spacing w:after="60"/>
+      </w:pPr>
+      <w:r>
+        <w:rPr>
+          <w:rFonts w:ascii="Arial" w:hAnsi="Arial" w:cs="Arial"/>
+          <w:sz w:val="20"/>
+          <w:szCs w:val="20"/>
+        </w:rPr>
+        <w:t>☐  Osoba pracująca</w:t>
+      </w:r>
+    </w:p>
+    <w:p>
+      <w:pPr>
+        <w:spacing w:after="60"/>
+      </w:pPr>
+      <w:r>
+        <w:rPr>
+          <w:rFonts w:ascii="Arial" w:hAnsi="Arial" w:cs="Arial"/>
+          <w:sz w:val="20"/>
+          <w:szCs w:val="20"/>
+        </w:rPr>
+        <w:t>☐  Osoba bezrobotna (zarejestrowana w PUP)</w:t>
+      </w:r>
+    </w:p>
+    <w:p>
+      <w:pPr>
+        <w:spacing w:after="60"/>
+      </w:pPr>
+      <w:r>
+        <w:rPr>
+          <w:rFonts w:ascii="Arial" w:hAnsi="Arial" w:cs="Arial"/>
+          <w:sz w:val="20"/>
+          <w:szCs w:val="20"/>
+        </w:rPr>
+        <w:t>☐  Osoba bezrobotna (niezarejestrowana)</w:t>
+      </w:r>
+    </w:p>
+    <w:p>
+      <w:pPr>
+        <w:spacing w:after="60"/>
+      </w:pPr>
+      <w:r>
+        <w:rPr>
+          <w:rFonts w:ascii="Arial" w:hAnsi="Arial" w:cs="Arial"/>
+          <w:sz w:val="20"/>
+          <w:szCs w:val="20"/>
+        </w:rPr>
+        <w:t>☐  Osoba bierna zawodowo</w:t>
+      </w:r>
+    </w:p>
+    <w:p>
+      <w:pPr>
+        <w:spacing w:after="60"/>
+      </w:pPr>
+      <w:r>
+        <w:rPr>
+          <w:rFonts w:ascii="Arial" w:hAnsi="Arial" w:cs="Arial"/>
+          <w:sz w:val="20"/>
+          <w:szCs w:val="20"/>
+        </w:rPr>
+        <w:t>☐  Emeryt/rencista</w:t>
       </w:r>
     </w:p>
     <w:p>
@@ -1080,122 +963,83 @@
     </w:p>
     <w:p>
       <w:pPr>
-        <w:spacing w:after="100" w:before="0"/>
-      </w:pPr>
-      <w:r>
-        <w:rPr>
-          <w:rFonts w:ascii="Arial" w:hAnsi="Arial" w:cs="Arial"/>
-          <w:sz w:val="20"/>
-          <w:szCs w:val="20"/>
+        <w:spacing w:after="100"/>
+      </w:pPr>
+      <w:r>
+        <w:rPr>
+          <w:rFonts w:ascii="Arial" w:hAnsi="Arial" w:cs="Arial"/>
           <w:b/>
           <w:bCs/>
-        </w:rPr>
-        <w:t xml:space="preserve">Wykształcenie (proszę zaznaczyć najwyższy ukończony poziom):</w:t>
-      </w:r>
-    </w:p>
-    <w:p>
-      <w:pPr>
-        <w:spacing w:after="60" w:before="0"/>
-      </w:pPr>
-      <w:r>
-        <w:rPr>
-          <w:rFonts w:ascii="Arial" w:hAnsi="Arial" w:cs="Arial"/>
-          <w:sz w:val="20"/>
-          <w:szCs w:val="20"/>
-        </w:rPr>
-        <w:t xml:space="preserve">☐  </w:t>
-      </w:r>
-      <w:r>
-        <w:rPr>
-          <w:rFonts w:ascii="Arial" w:hAnsi="Arial" w:cs="Arial"/>
-          <w:sz w:val="20"/>
-          <w:szCs w:val="20"/>
-        </w:rPr>
-        <w:t xml:space="preserve">Podstawowe</w:t>
-      </w:r>
-    </w:p>
-    <w:p>
-      <w:pPr>
-        <w:spacing w:after="60" w:before="0"/>
-      </w:pPr>
-      <w:r>
-        <w:rPr>
-          <w:rFonts w:ascii="Arial" w:hAnsi="Arial" w:cs="Arial"/>
-          <w:sz w:val="20"/>
-          <w:szCs w:val="20"/>
-        </w:rPr>
-        <w:t xml:space="preserve">☐  </w:t>
-      </w:r>
-      <w:r>
-        <w:rPr>
-          <w:rFonts w:ascii="Arial" w:hAnsi="Arial" w:cs="Arial"/>
-          <w:sz w:val="20"/>
-          <w:szCs w:val="20"/>
-        </w:rPr>
-        <w:t xml:space="preserve">Gimnazjalne</w:t>
-      </w:r>
-    </w:p>
-    <w:p>
-      <w:pPr>
-        <w:spacing w:after="60" w:before="0"/>
-      </w:pPr>
-      <w:r>
-        <w:rPr>
-          <w:rFonts w:ascii="Arial" w:hAnsi="Arial" w:cs="Arial"/>
-          <w:sz w:val="20"/>
-          <w:szCs w:val="20"/>
-        </w:rPr>
-        <w:t xml:space="preserve">☐  </w:t>
-      </w:r>
-      <w:r>
-        <w:rPr>
-          <w:rFonts w:ascii="Arial" w:hAnsi="Arial" w:cs="Arial"/>
-          <w:sz w:val="20"/>
-          <w:szCs w:val="20"/>
-        </w:rPr>
-        <w:t xml:space="preserve">Ponadgimnazjalne / średnie</w:t>
-      </w:r>
-    </w:p>
-    <w:p>
-      <w:pPr>
-        <w:spacing w:after="60" w:before="0"/>
-      </w:pPr>
-      <w:r>
-        <w:rPr>
-          <w:rFonts w:ascii="Arial" w:hAnsi="Arial" w:cs="Arial"/>
-          <w:sz w:val="20"/>
-          <w:szCs w:val="20"/>
-        </w:rPr>
-        <w:t xml:space="preserve">☐  </w:t>
-      </w:r>
-      <w:r>
-        <w:rPr>
-          <w:rFonts w:ascii="Arial" w:hAnsi="Arial" w:cs="Arial"/>
-          <w:sz w:val="20"/>
-          <w:szCs w:val="20"/>
-        </w:rPr>
-        <w:t xml:space="preserve">Policealne</w:t>
-      </w:r>
-    </w:p>
-    <w:p>
-      <w:pPr>
-        <w:spacing w:after="60" w:before="0"/>
-      </w:pPr>
-      <w:r>
-        <w:rPr>
-          <w:rFonts w:ascii="Arial" w:hAnsi="Arial" w:cs="Arial"/>
-          <w:sz w:val="20"/>
-          <w:szCs w:val="20"/>
-        </w:rPr>
-        <w:t xml:space="preserve">☐  </w:t>
-      </w:r>
-      <w:r>
-        <w:rPr>
-          <w:rFonts w:ascii="Arial" w:hAnsi="Arial" w:cs="Arial"/>
-          <w:sz w:val="20"/>
-          <w:szCs w:val="20"/>
-        </w:rPr>
-        <w:t xml:space="preserve">Wyższe</w:t>
+          <w:sz w:val="20"/>
+          <w:szCs w:val="20"/>
+        </w:rPr>
+        <w:t>Wykształcenie (proszę zaznaczyć najwyższy ukończony poziom):</w:t>
+      </w:r>
+    </w:p>
+    <w:p>
+      <w:pPr>
+        <w:spacing w:after="60"/>
+      </w:pPr>
+      <w:r>
+        <w:rPr>
+          <w:rFonts w:ascii="Arial" w:hAnsi="Arial" w:cs="Arial"/>
+          <w:sz w:val="20"/>
+          <w:szCs w:val="20"/>
+        </w:rPr>
+        <w:lastRenderedPageBreak/>
+        <w:t>☐  Podstawowe</w:t>
+      </w:r>
+    </w:p>
+    <w:p>
+      <w:pPr>
+        <w:spacing w:after="60"/>
+      </w:pPr>
+      <w:r>
+        <w:rPr>
+          <w:rFonts w:ascii="Arial" w:hAnsi="Arial" w:cs="Arial"/>
+          <w:sz w:val="20"/>
+          <w:szCs w:val="20"/>
+        </w:rPr>
+        <w:t>☐  Gimnazjalne</w:t>
+      </w:r>
+    </w:p>
+    <w:p>
+      <w:pPr>
+        <w:spacing w:after="60"/>
+      </w:pPr>
+      <w:r>
+        <w:rPr>
+          <w:rFonts w:ascii="Arial" w:hAnsi="Arial" w:cs="Arial"/>
+          <w:sz w:val="20"/>
+          <w:szCs w:val="20"/>
+        </w:rPr>
+        <w:t>☐  Ponadgimnazjalne / średnie</w:t>
+      </w:r>
+    </w:p>
+    <w:p>
+      <w:pPr>
+        <w:spacing w:after="60"/>
+      </w:pPr>
+      <w:r>
+        <w:rPr>
+          <w:rFonts w:ascii="Arial" w:hAnsi="Arial" w:cs="Arial"/>
+          <w:sz w:val="20"/>
+          <w:szCs w:val="20"/>
+        </w:rPr>
+        <w:t>☐  Policealne</w:t>
+      </w:r>
+    </w:p>
+    <w:p>
+      <w:pPr>
+        <w:spacing w:after="60"/>
+      </w:pPr>
+      <w:r>
+        <w:rPr>
+          <w:rFonts w:ascii="Arial" w:hAnsi="Arial" w:cs="Arial"/>
+          <w:sz w:val="20"/>
+          <w:szCs w:val="20"/>
+        </w:rPr>
+        <w:t>☐  Wyższe</w:t>
       </w:r>
     </w:p>
     <w:p>
@@ -1205,59 +1049,43 @@
     </w:p>
     <w:p>
       <w:pPr>
-        <w:spacing w:after="100" w:before="0"/>
-      </w:pPr>
-      <w:r>
-        <w:rPr>
-          <w:rFonts w:ascii="Arial" w:hAnsi="Arial" w:cs="Arial"/>
-          <w:sz w:val="20"/>
-          <w:szCs w:val="20"/>
+        <w:spacing w:after="100"/>
+      </w:pPr>
+      <w:r>
+        <w:rPr>
+          <w:rFonts w:ascii="Arial" w:hAnsi="Arial" w:cs="Arial"/>
           <w:b/>
           <w:bCs/>
-        </w:rPr>
-        <w:t xml:space="preserve">Niepełnosprawność:</w:t>
-      </w:r>
-    </w:p>
-    <w:p>
-      <w:pPr>
-        <w:spacing w:after="60" w:before="0"/>
-      </w:pPr>
-      <w:r>
-        <w:rPr>
-          <w:rFonts w:ascii="Arial" w:hAnsi="Arial" w:cs="Arial"/>
-          <w:sz w:val="20"/>
-          <w:szCs w:val="20"/>
-        </w:rPr>
-        <w:t xml:space="preserve">☐  </w:t>
-      </w:r>
-      <w:r>
-        <w:rPr>
-          <w:rFonts w:ascii="Arial" w:hAnsi="Arial" w:cs="Arial"/>
-          <w:sz w:val="20"/>
-          <w:szCs w:val="20"/>
-        </w:rPr>
-        <w:t xml:space="preserve">NIE – nie posiadam orzeczenia o niepełnosprawności</w:t>
-      </w:r>
-    </w:p>
-    <w:p>
-      <w:pPr>
-        <w:spacing w:after="60" w:before="0"/>
-      </w:pPr>
-      <w:r>
-        <w:rPr>
-          <w:rFonts w:ascii="Arial" w:hAnsi="Arial" w:cs="Arial"/>
-          <w:sz w:val="20"/>
-          <w:szCs w:val="20"/>
-        </w:rPr>
-        <w:t xml:space="preserve">☐  </w:t>
-      </w:r>
-      <w:r>
-        <w:rPr>
-          <w:rFonts w:ascii="Arial" w:hAnsi="Arial" w:cs="Arial"/>
-          <w:sz w:val="20"/>
-          <w:szCs w:val="20"/>
-        </w:rPr>
-        <w:t xml:space="preserve">TAK – posiadam orzeczenie o niepełnosprawności (rodzaj: ..........................................)</w:t>
+          <w:sz w:val="20"/>
+          <w:szCs w:val="20"/>
+        </w:rPr>
+        <w:t>Niepełnosprawność:</w:t>
+      </w:r>
+    </w:p>
+    <w:p>
+      <w:pPr>
+        <w:spacing w:after="60"/>
+      </w:pPr>
+      <w:r>
+        <w:rPr>
+          <w:rFonts w:ascii="Arial" w:hAnsi="Arial" w:cs="Arial"/>
+          <w:sz w:val="20"/>
+          <w:szCs w:val="20"/>
+        </w:rPr>
+        <w:t>☐  NIE – nie posiadam orzeczenia o niepełnosprawności</w:t>
+      </w:r>
+    </w:p>
+    <w:p>
+      <w:pPr>
+        <w:spacing w:after="60"/>
+      </w:pPr>
+      <w:r>
+        <w:rPr>
+          <w:rFonts w:ascii="Arial" w:hAnsi="Arial" w:cs="Arial"/>
+          <w:sz w:val="20"/>
+          <w:szCs w:val="20"/>
+        </w:rPr>
+        <w:t>☐  TAK – posiadam orzeczenie o niepełnosprawności (rodzaj: ..........................................)</w:t>
       </w:r>
     </w:p>
     <w:p>
@@ -1267,148 +1095,95 @@
     </w:p>
     <w:p>
       <w:pPr>
-        <w:spacing w:after="100" w:before="0"/>
-      </w:pPr>
-      <w:r>
-        <w:rPr>
-          <w:rFonts w:ascii="Arial" w:hAnsi="Arial" w:cs="Arial"/>
-          <w:sz w:val="20"/>
-          <w:szCs w:val="20"/>
+        <w:spacing w:after="100"/>
+      </w:pPr>
+      <w:r>
+        <w:rPr>
+          <w:rFonts w:ascii="Arial" w:hAnsi="Arial" w:cs="Arial"/>
           <w:b/>
           <w:bCs/>
-        </w:rPr>
-        <w:t xml:space="preserve">Potrzeby w zakresie dostępności (jeśli dotyczy, proszę zaznaczyć):</w:t>
-      </w:r>
-    </w:p>
-    <w:p>
-      <w:pPr>
-        <w:spacing w:after="60" w:before="0"/>
-      </w:pPr>
-      <w:r>
-        <w:rPr>
-          <w:rFonts w:ascii="Arial" w:hAnsi="Arial" w:cs="Arial"/>
-          <w:sz w:val="20"/>
-          <w:szCs w:val="20"/>
-        </w:rPr>
-        <w:t xml:space="preserve">☐  </w:t>
-      </w:r>
-      <w:r>
-        <w:rPr>
-          <w:rFonts w:ascii="Arial" w:hAnsi="Arial" w:cs="Arial"/>
-          <w:sz w:val="20"/>
-          <w:szCs w:val="20"/>
-        </w:rPr>
-        <w:t xml:space="preserve">Materiały w dużej czcionce</w:t>
-      </w:r>
-    </w:p>
-    <w:p>
-      <w:pPr>
-        <w:spacing w:after="60" w:before="0"/>
-      </w:pPr>
-      <w:r>
-        <w:rPr>
-          <w:rFonts w:ascii="Arial" w:hAnsi="Arial" w:cs="Arial"/>
-          <w:sz w:val="20"/>
-          <w:szCs w:val="20"/>
-        </w:rPr>
-        <w:t xml:space="preserve">☐  </w:t>
-      </w:r>
-      <w:r>
-        <w:rPr>
-          <w:rFonts w:ascii="Arial" w:hAnsi="Arial" w:cs="Arial"/>
-          <w:sz w:val="20"/>
-          <w:szCs w:val="20"/>
-        </w:rPr>
-        <w:t xml:space="preserve">Materiały w formacie łatwym do odczytu (ETR)</w:t>
-      </w:r>
-    </w:p>
-    <w:p>
-      <w:pPr>
-        <w:spacing w:after="60" w:before="0"/>
-      </w:pPr>
-      <w:r>
-        <w:rPr>
-          <w:rFonts w:ascii="Arial" w:hAnsi="Arial" w:cs="Arial"/>
-          <w:sz w:val="20"/>
-          <w:szCs w:val="20"/>
-        </w:rPr>
-        <w:t xml:space="preserve">☐  </w:t>
-      </w:r>
-      <w:r>
-        <w:rPr>
-          <w:rFonts w:ascii="Arial" w:hAnsi="Arial" w:cs="Arial"/>
-          <w:sz w:val="20"/>
-          <w:szCs w:val="20"/>
-        </w:rPr>
-        <w:t xml:space="preserve">Wsparcie asystenta osoby z niepełnosprawnością</w:t>
-      </w:r>
-    </w:p>
-    <w:p>
-      <w:pPr>
-        <w:spacing w:after="60" w:before="0"/>
-      </w:pPr>
-      <w:r>
-        <w:rPr>
-          <w:rFonts w:ascii="Arial" w:hAnsi="Arial" w:cs="Arial"/>
-          <w:sz w:val="20"/>
-          <w:szCs w:val="20"/>
-        </w:rPr>
-        <w:t xml:space="preserve">☐  </w:t>
-      </w:r>
-      <w:r>
-        <w:rPr>
-          <w:rFonts w:ascii="Arial" w:hAnsi="Arial" w:cs="Arial"/>
-          <w:sz w:val="20"/>
-          <w:szCs w:val="20"/>
-        </w:rPr>
-        <w:t xml:space="preserve">Podjazdy / dostępność architektoniczna</w:t>
-      </w:r>
-    </w:p>
-    <w:p>
-      <w:pPr>
-        <w:spacing w:after="60" w:before="0"/>
-      </w:pPr>
-      <w:r>
-        <w:rPr>
-          <w:rFonts w:ascii="Arial" w:hAnsi="Arial" w:cs="Arial"/>
-          <w:sz w:val="20"/>
-          <w:szCs w:val="20"/>
-        </w:rPr>
-        <w:t xml:space="preserve">☐  </w:t>
-      </w:r>
-      <w:r>
-        <w:rPr>
-          <w:rFonts w:ascii="Arial" w:hAnsi="Arial" w:cs="Arial"/>
-          <w:sz w:val="20"/>
-          <w:szCs w:val="20"/>
-        </w:rPr>
-        <w:t xml:space="preserve">Wsparcie telefoniczne / zdalne</w:t>
-      </w:r>
-    </w:p>
-    <w:p>
-      <w:pPr>
-        <w:spacing w:after="60" w:before="0"/>
-      </w:pPr>
-      <w:r>
-        <w:rPr>
-          <w:rFonts w:ascii="Arial" w:hAnsi="Arial" w:cs="Arial"/>
-          <w:sz w:val="20"/>
-          <w:szCs w:val="20"/>
-        </w:rPr>
-        <w:t xml:space="preserve">☐  </w:t>
-      </w:r>
-      <w:r>
-        <w:rPr>
-          <w:rFonts w:ascii="Arial" w:hAnsi="Arial" w:cs="Arial"/>
-          <w:sz w:val="20"/>
-          <w:szCs w:val="20"/>
-        </w:rPr>
-        <w:t xml:space="preserve">Inne potrzeby: posiadam stary smartfon i wnioskuję o możliwość otrzymania nowego modelu.</w:t>
-      </w:r>
-    </w:p>
-    <w:p>
-      <w:r>
-        <w:br w:type="page"/>
+          <w:sz w:val="20"/>
+          <w:szCs w:val="20"/>
+        </w:rPr>
+        <w:t>Potrzeby w zakresie dostępności (jeśli dotyczy, proszę zaznaczyć):</w:t>
+      </w:r>
+    </w:p>
+    <w:p>
+      <w:pPr>
+        <w:spacing w:after="60"/>
+      </w:pPr>
+      <w:r>
+        <w:rPr>
+          <w:rFonts w:ascii="Arial" w:hAnsi="Arial" w:cs="Arial"/>
+          <w:sz w:val="20"/>
+          <w:szCs w:val="20"/>
+        </w:rPr>
+        <w:t>☐  Materiały w dużej czcionce</w:t>
+      </w:r>
+    </w:p>
+    <w:p>
+      <w:pPr>
+        <w:spacing w:after="60"/>
+      </w:pPr>
+      <w:r>
+        <w:rPr>
+          <w:rFonts w:ascii="Arial" w:hAnsi="Arial" w:cs="Arial"/>
+          <w:sz w:val="20"/>
+          <w:szCs w:val="20"/>
+        </w:rPr>
+        <w:t>☐  Materiały w formacie łatwym do odczytu (ETR)</w:t>
+      </w:r>
+    </w:p>
+    <w:p>
+      <w:pPr>
+        <w:spacing w:after="60"/>
+      </w:pPr>
+      <w:r>
+        <w:rPr>
+          <w:rFonts w:ascii="Arial" w:hAnsi="Arial" w:cs="Arial"/>
+          <w:sz w:val="20"/>
+          <w:szCs w:val="20"/>
+        </w:rPr>
+        <w:t>☐  Wsparcie asystenta osoby z niepełnosprawnością</w:t>
+      </w:r>
+    </w:p>
+    <w:p>
+      <w:pPr>
+        <w:spacing w:after="60"/>
+      </w:pPr>
+      <w:r>
+        <w:rPr>
+          <w:rFonts w:ascii="Arial" w:hAnsi="Arial" w:cs="Arial"/>
+          <w:sz w:val="20"/>
+          <w:szCs w:val="20"/>
+        </w:rPr>
+        <w:t>☐  Podjazdy / dostępność architektoniczna</w:t>
+      </w:r>
+    </w:p>
+    <w:p>
+      <w:pPr>
+        <w:spacing w:after="60"/>
+      </w:pPr>
+      <w:r>
+        <w:rPr>
+          <w:rFonts w:ascii="Arial" w:hAnsi="Arial" w:cs="Arial"/>
+          <w:sz w:val="20"/>
+          <w:szCs w:val="20"/>
+        </w:rPr>
+        <w:t>☐  Wsparcie telefoniczne / zdalne</w:t>
+      </w:r>
+    </w:p>
+    <w:p>
+      <w:pPr>
+        <w:spacing w:after="60"/>
+      </w:pPr>
+      <w:r>
+        <w:rPr>
+          <w:rFonts w:ascii="Arial" w:hAnsi="Arial" w:cs="Arial"/>
+          <w:sz w:val="20"/>
+          <w:szCs w:val="20"/>
+        </w:rPr>
+        <w:t>☐  Inne potrzeby: posiadam stary smartfon i wnioskuję o możliwość otrzymania nowego modelu.</w:t>
       </w:r>
     </w:p>
     <w:p>
@@ -1421,133 +1196,91 @@
       <w:r>
         <w:rPr>
           <w:rFonts w:ascii="Arial" w:hAnsi="Arial" w:cs="Arial"/>
-          <w:sz w:val="24"/>
-          <w:szCs w:val="24"/>
           <w:b/>
           <w:bCs/>
           <w:color w:val="2F5496"/>
         </w:rPr>
-        <w:t xml:space="preserve">SEKCJA C: OŚWIADCZENIA KWALIFIKACYJNE</w:t>
-      </w:r>
-    </w:p>
-    <w:p>
-      <w:pPr>
-        <w:spacing w:after="150" w:before="0"/>
-      </w:pPr>
-      <w:r>
-        <w:rPr>
-          <w:rFonts w:ascii="Arial" w:hAnsi="Arial" w:cs="Arial"/>
-          <w:sz w:val="20"/>
-          <w:szCs w:val="20"/>
+        <w:t>SEKCJA C: OŚWIADCZENIA KWALIFIKACYJNE</w:t>
+      </w:r>
+    </w:p>
+    <w:p>
+      <w:pPr>
+        <w:spacing w:after="150"/>
+      </w:pPr>
+      <w:r>
+        <w:rPr>
+          <w:rFonts w:ascii="Arial" w:hAnsi="Arial" w:cs="Arial"/>
           <w:b/>
           <w:bCs/>
-        </w:rPr>
-        <w:t xml:space="preserve">Potwierdzam, że spełniam WSZYSTKIE poniższe kryteria kwalifikowalności (proszę zaznaczyć każde):</w:t>
-      </w:r>
-    </w:p>
-    <w:p>
-      <w:pPr>
-        <w:spacing w:after="60" w:before="0"/>
-      </w:pPr>
-      <w:r>
-        <w:rPr>
-          <w:rFonts w:ascii="Arial" w:hAnsi="Arial" w:cs="Arial"/>
-          <w:sz w:val="20"/>
-          <w:szCs w:val="20"/>
-        </w:rPr>
-        <w:t xml:space="preserve">☐  </w:t>
-      </w:r>
-      <w:r>
-        <w:rPr>
-          <w:rFonts w:ascii="Arial" w:hAnsi="Arial" w:cs="Arial"/>
-          <w:sz w:val="20"/>
-          <w:szCs w:val="20"/>
-        </w:rPr>
-        <w:t xml:space="preserve">Jestem osobą dorosłą (ukończone 18 lat).</w:t>
-      </w:r>
-    </w:p>
-    <w:p>
-      <w:pPr>
-        <w:spacing w:after="60" w:before="0"/>
-      </w:pPr>
-      <w:r>
-        <w:rPr>
-          <w:rFonts w:ascii="Arial" w:hAnsi="Arial" w:cs="Arial"/>
-          <w:sz w:val="20"/>
-          <w:szCs w:val="20"/>
-        </w:rPr>
-        <w:t xml:space="preserve">☐  </w:t>
-      </w:r>
-      <w:r>
-        <w:rPr>
-          <w:rFonts w:ascii="Arial" w:hAnsi="Arial" w:cs="Arial"/>
-          <w:sz w:val="20"/>
-          <w:szCs w:val="20"/>
-        </w:rPr>
-        <w:t xml:space="preserve">Zamieszkuję / pracuję / przebywam na terenie województwa lubuskiego (w rozumieniu Kodeksu Cywilnego).</w:t>
-      </w:r>
-    </w:p>
-    <w:p>
-      <w:pPr>
-        <w:spacing w:after="60" w:before="0"/>
-      </w:pPr>
-      <w:r>
-        <w:rPr>
-          <w:rFonts w:ascii="Arial" w:hAnsi="Arial" w:cs="Arial"/>
-          <w:sz w:val="20"/>
-          <w:szCs w:val="20"/>
-        </w:rPr>
-        <w:t xml:space="preserve">☐  </w:t>
-      </w:r>
-      <w:r>
-        <w:rPr>
-          <w:rFonts w:ascii="Arial" w:hAnsi="Arial" w:cs="Arial"/>
-          <w:sz w:val="20"/>
-          <w:szCs w:val="20"/>
-        </w:rPr>
-        <w:t xml:space="preserve">Nie uczestniczę w dalszym kształceniu w systemie oświaty (szkoła, studia).</w:t>
-      </w:r>
-    </w:p>
-    <w:p>
-      <w:pPr>
-        <w:spacing w:after="60" w:before="0"/>
-      </w:pPr>
-      <w:r>
-        <w:rPr>
-          <w:rFonts w:ascii="Arial" w:hAnsi="Arial" w:cs="Arial"/>
-          <w:sz w:val="20"/>
-          <w:szCs w:val="20"/>
-        </w:rPr>
-        <w:t xml:space="preserve">☐  </w:t>
-      </w:r>
-      <w:r>
-        <w:rPr>
-          <w:rFonts w:ascii="Arial" w:hAnsi="Arial" w:cs="Arial"/>
-          <w:sz w:val="20"/>
-          <w:szCs w:val="20"/>
-        </w:rPr>
-        <w:t xml:space="preserve">Nie prowadzę działalności gospodarczej ani oświatowej.</w:t>
-      </w:r>
-    </w:p>
-    <w:p>
-      <w:pPr>
-        <w:spacing w:after="60" w:before="0"/>
-      </w:pPr>
-      <w:r>
-        <w:rPr>
-          <w:rFonts w:ascii="Arial" w:hAnsi="Arial" w:cs="Arial"/>
-          <w:sz w:val="20"/>
-          <w:szCs w:val="20"/>
-        </w:rPr>
-        <w:t xml:space="preserve">☐  </w:t>
-      </w:r>
-      <w:r>
-        <w:rPr>
-          <w:rFonts w:ascii="Arial" w:hAnsi="Arial" w:cs="Arial"/>
-          <w:sz w:val="20"/>
-          <w:szCs w:val="20"/>
-        </w:rPr>
-        <w:t xml:space="preserve">Z własnej woli zgłaszam chęć podnoszenia lub uzupełniania umiejętności podstawowych (rozumienie informacji, rozumowanie matematyczne, umiejętności cyfrowe).</w:t>
+          <w:sz w:val="20"/>
+          <w:szCs w:val="20"/>
+        </w:rPr>
+        <w:t>Potwierdzam, że spełniam WSZYSTKIE poniższe kryteria kwalifikowalności (proszę zaznaczyć każde):</w:t>
+      </w:r>
+    </w:p>
+    <w:p>
+      <w:pPr>
+        <w:spacing w:after="60"/>
+      </w:pPr>
+      <w:r>
+        <w:rPr>
+          <w:rFonts w:ascii="Arial" w:hAnsi="Arial" w:cs="Arial"/>
+          <w:sz w:val="20"/>
+          <w:szCs w:val="20"/>
+        </w:rPr>
+        <w:t>☐  Jestem osobą dorosłą (ukończone 18 lat).</w:t>
+      </w:r>
+    </w:p>
+    <w:p>
+      <w:pPr>
+        <w:spacing w:after="60"/>
+      </w:pPr>
+      <w:r>
+        <w:rPr>
+          <w:rFonts w:ascii="Arial" w:hAnsi="Arial" w:cs="Arial"/>
+          <w:sz w:val="20"/>
+          <w:szCs w:val="20"/>
+        </w:rPr>
+        <w:t>☐  Zamieszkuję / pracuję / przebywam na terenie województwa lubuskiego (w rozumieniu Kodeksu Cywilnego).</w:t>
+      </w:r>
+    </w:p>
+    <w:p>
+      <w:pPr>
+        <w:spacing w:after="60"/>
+      </w:pPr>
+      <w:r>
+        <w:rPr>
+          <w:rFonts w:ascii="Arial" w:hAnsi="Arial" w:cs="Arial"/>
+          <w:sz w:val="20"/>
+          <w:szCs w:val="20"/>
+        </w:rPr>
+        <w:t>☐  Nie uczestniczę w dalszym kształceniu w systemie oświaty (szkoła, studia).</w:t>
+      </w:r>
+    </w:p>
+    <w:p>
+      <w:pPr>
+        <w:spacing w:after="60"/>
+      </w:pPr>
+      <w:r>
+        <w:rPr>
+          <w:rFonts w:ascii="Arial" w:hAnsi="Arial" w:cs="Arial"/>
+          <w:sz w:val="20"/>
+          <w:szCs w:val="20"/>
+        </w:rPr>
+        <w:t>☐  Nie prowadzę działalności gospodarczej ani oświatowej.</w:t>
+      </w:r>
+    </w:p>
+    <w:p>
+      <w:pPr>
+        <w:spacing w:after="60"/>
+      </w:pPr>
+      <w:r>
+        <w:rPr>
+          <w:rFonts w:ascii="Arial" w:hAnsi="Arial" w:cs="Arial"/>
+          <w:sz w:val="20"/>
+          <w:szCs w:val="20"/>
+        </w:rPr>
+        <w:t>☐  Z własnej woli zgłaszam chęć podnoszenia lub uzupełniania umiejętności podstawowych (rozumienie informacji, rozumowanie matematyczne, umiejętności cyfrowe).</w:t>
       </w:r>
     </w:p>
     <w:p>
@@ -1560,133 +1293,92 @@
       <w:r>
         <w:rPr>
           <w:rFonts w:ascii="Arial" w:hAnsi="Arial" w:cs="Arial"/>
-          <w:sz w:val="24"/>
-          <w:szCs w:val="24"/>
           <w:b/>
           <w:bCs/>
           <w:color w:val="2F5496"/>
         </w:rPr>
-        <w:t xml:space="preserve">SEKCJA D: DEKLARACJA UCZESTNICTWA</w:t>
-      </w:r>
-    </w:p>
-    <w:p>
-      <w:pPr>
-        <w:spacing w:after="100" w:before="0"/>
-      </w:pPr>
-      <w:r>
-        <w:rPr>
-          <w:rFonts w:ascii="Arial" w:hAnsi="Arial" w:cs="Arial"/>
-          <w:sz w:val="20"/>
-          <w:szCs w:val="20"/>
+        <w:t>SEKCJA D: DEKLARACJA UCZESTNICTWA</w:t>
+      </w:r>
+    </w:p>
+    <w:p>
+      <w:pPr>
+        <w:spacing w:after="100"/>
+      </w:pPr>
+      <w:r>
+        <w:rPr>
+          <w:rFonts w:ascii="Arial" w:hAnsi="Arial" w:cs="Arial"/>
           <w:b/>
           <w:bCs/>
-        </w:rPr>
-        <w:t xml:space="preserve">Zobowiązuję się do:</w:t>
-      </w:r>
-    </w:p>
-    <w:p>
-      <w:pPr>
-        <w:spacing w:after="60" w:before="0"/>
-      </w:pPr>
-      <w:r>
-        <w:rPr>
-          <w:rFonts w:ascii="Arial" w:hAnsi="Arial" w:cs="Arial"/>
-          <w:sz w:val="20"/>
-          <w:szCs w:val="20"/>
-        </w:rPr>
-        <w:t xml:space="preserve">☐  </w:t>
-      </w:r>
-      <w:r>
-        <w:rPr>
-          <w:rFonts w:ascii="Arial" w:hAnsi="Arial" w:cs="Arial"/>
-          <w:sz w:val="20"/>
-          <w:szCs w:val="20"/>
-        </w:rPr>
-        <w:t xml:space="preserve">Udziału w indywidualnej diagnozie umiejętności podstawowych (2h).</w:t>
-      </w:r>
-    </w:p>
-    <w:p>
-      <w:pPr>
-        <w:spacing w:after="60" w:before="0"/>
-      </w:pPr>
-      <w:r>
-        <w:rPr>
-          <w:rFonts w:ascii="Arial" w:hAnsi="Arial" w:cs="Arial"/>
-          <w:sz w:val="20"/>
-          <w:szCs w:val="20"/>
-        </w:rPr>
-        <w:t xml:space="preserve">☐  </w:t>
-      </w:r>
-      <w:r>
-        <w:rPr>
-          <w:rFonts w:ascii="Arial" w:hAnsi="Arial" w:cs="Arial"/>
-          <w:sz w:val="20"/>
-          <w:szCs w:val="20"/>
-        </w:rPr>
-        <w:t xml:space="preserve">Regularnego uczestnictwa w zajęciach edukacyjnych (grupowych i/lub indywidualnych).</w:t>
-      </w:r>
-    </w:p>
-    <w:p>
-      <w:pPr>
-        <w:spacing w:after="60" w:before="0"/>
-      </w:pPr>
-      <w:r>
-        <w:rPr>
-          <w:rFonts w:ascii="Arial" w:hAnsi="Arial" w:cs="Arial"/>
-          <w:sz w:val="20"/>
-          <w:szCs w:val="20"/>
-        </w:rPr>
-        <w:t xml:space="preserve">☐  </w:t>
-      </w:r>
-      <w:r>
-        <w:rPr>
-          <w:rFonts w:ascii="Arial" w:hAnsi="Arial" w:cs="Arial"/>
-          <w:sz w:val="20"/>
-          <w:szCs w:val="20"/>
-        </w:rPr>
-        <w:t xml:space="preserve">Udziału w walidacji efektów uczenia się po zakończeniu ścieżki edukacyjnej.</w:t>
-      </w:r>
-    </w:p>
-    <w:p>
-      <w:pPr>
-        <w:spacing w:after="60" w:before="0"/>
-      </w:pPr>
-      <w:r>
-        <w:rPr>
-          <w:rFonts w:ascii="Arial" w:hAnsi="Arial" w:cs="Arial"/>
-          <w:sz w:val="20"/>
-          <w:szCs w:val="20"/>
-        </w:rPr>
-        <w:t xml:space="preserve">☐  </w:t>
-      </w:r>
-      <w:r>
-        <w:rPr>
-          <w:rFonts w:ascii="Arial" w:hAnsi="Arial" w:cs="Arial"/>
-          <w:sz w:val="20"/>
-          <w:szCs w:val="20"/>
-        </w:rPr>
-        <w:t xml:space="preserve">Wypełniania ankiet ewaluacyjnych.</w:t>
-      </w:r>
-    </w:p>
-    <w:p>
-      <w:pPr>
-        <w:spacing w:after="60" w:before="0"/>
-      </w:pPr>
-      <w:r>
-        <w:rPr>
-          <w:rFonts w:ascii="Arial" w:hAnsi="Arial" w:cs="Arial"/>
-          <w:sz w:val="20"/>
-          <w:szCs w:val="20"/>
-        </w:rPr>
-        <w:t xml:space="preserve">☐  </w:t>
-      </w:r>
-      <w:r>
-        <w:rPr>
-          <w:rFonts w:ascii="Arial" w:hAnsi="Arial" w:cs="Arial"/>
-          <w:sz w:val="20"/>
-          <w:szCs w:val="20"/>
-        </w:rPr>
-        <w:t xml:space="preserve">Niezwłocznego informowania Koordynatora projektu o zmianach danych osobowych lub rezygnacji z udziału.</w:t>
+          <w:sz w:val="20"/>
+          <w:szCs w:val="20"/>
+        </w:rPr>
+        <w:t>Zobowiązuję się do:</w:t>
+      </w:r>
+    </w:p>
+    <w:p>
+      <w:pPr>
+        <w:spacing w:after="60"/>
+      </w:pPr>
+      <w:r>
+        <w:rPr>
+          <w:rFonts w:ascii="Arial" w:hAnsi="Arial" w:cs="Arial"/>
+          <w:sz w:val="20"/>
+          <w:szCs w:val="20"/>
+        </w:rPr>
+        <w:t>☐  Udziału w indywidualnej diagnozie umiejętności podstawowych (2h).</w:t>
+      </w:r>
+    </w:p>
+    <w:p>
+      <w:pPr>
+        <w:spacing w:after="60"/>
+      </w:pPr>
+      <w:r>
+        <w:rPr>
+          <w:rFonts w:ascii="Arial" w:hAnsi="Arial" w:cs="Arial"/>
+          <w:sz w:val="20"/>
+          <w:szCs w:val="20"/>
+        </w:rPr>
+        <w:t>☐  Regularnego uczestnictwa w zajęciach edukacyjnych (grupowych i/lub indywidualnych).</w:t>
+      </w:r>
+    </w:p>
+    <w:p>
+      <w:pPr>
+        <w:spacing w:after="60"/>
+      </w:pPr>
+      <w:r>
+        <w:rPr>
+          <w:rFonts w:ascii="Arial" w:hAnsi="Arial" w:cs="Arial"/>
+          <w:sz w:val="20"/>
+          <w:szCs w:val="20"/>
+        </w:rPr>
+        <w:t>☐  Udziału w walidacji efektów uczenia się po zakończeniu ścieżki edukacyjnej.</w:t>
+      </w:r>
+    </w:p>
+    <w:p>
+      <w:pPr>
+        <w:spacing w:after="60"/>
+      </w:pPr>
+      <w:r>
+        <w:rPr>
+          <w:rFonts w:ascii="Arial" w:hAnsi="Arial" w:cs="Arial"/>
+          <w:sz w:val="20"/>
+          <w:szCs w:val="20"/>
+        </w:rPr>
+        <w:t>☐  Wypełniania ankiet ewaluacyjnych.</w:t>
+      </w:r>
+    </w:p>
+    <w:p>
+      <w:pPr>
+        <w:spacing w:after="60"/>
+      </w:pPr>
+      <w:r>
+        <w:rPr>
+          <w:rFonts w:ascii="Arial" w:hAnsi="Arial" w:cs="Arial"/>
+          <w:sz w:val="20"/>
+          <w:szCs w:val="20"/>
+        </w:rPr>
+        <w:lastRenderedPageBreak/>
+        <w:t>☐  Niezwłocznego informowania Koordynatora projektu o zmianach danych osobowych lub rezygnacji z udziału.</w:t>
       </w:r>
     </w:p>
     <w:p>
@@ -1696,59 +1388,43 @@
     </w:p>
     <w:p>
       <w:pPr>
-        <w:spacing w:after="100" w:before="0"/>
-      </w:pPr>
-      <w:r>
-        <w:rPr>
-          <w:rFonts w:ascii="Arial" w:hAnsi="Arial" w:cs="Arial"/>
-          <w:sz w:val="20"/>
-          <w:szCs w:val="20"/>
+        <w:spacing w:after="100"/>
+      </w:pPr>
+      <w:r>
+        <w:rPr>
+          <w:rFonts w:ascii="Arial" w:hAnsi="Arial" w:cs="Arial"/>
           <w:b/>
           <w:bCs/>
-        </w:rPr>
-        <w:t xml:space="preserve">Potwierdzam zapoznanie się z:</w:t>
-      </w:r>
-    </w:p>
-    <w:p>
-      <w:pPr>
-        <w:spacing w:after="60" w:before="0"/>
-      </w:pPr>
-      <w:r>
-        <w:rPr>
-          <w:rFonts w:ascii="Arial" w:hAnsi="Arial" w:cs="Arial"/>
-          <w:sz w:val="20"/>
-          <w:szCs w:val="20"/>
-        </w:rPr>
-        <w:t xml:space="preserve">☐  </w:t>
-      </w:r>
-      <w:r>
-        <w:rPr>
-          <w:rFonts w:ascii="Arial" w:hAnsi="Arial" w:cs="Arial"/>
-          <w:sz w:val="20"/>
-          <w:szCs w:val="20"/>
-        </w:rPr>
-        <w:t xml:space="preserve">Regulaminem rekrutacji i uczestnictwa w projekcie.</w:t>
-      </w:r>
-    </w:p>
-    <w:p>
-      <w:pPr>
-        <w:spacing w:after="60" w:before="0"/>
-      </w:pPr>
-      <w:r>
-        <w:rPr>
-          <w:rFonts w:ascii="Arial" w:hAnsi="Arial" w:cs="Arial"/>
-          <w:sz w:val="20"/>
-          <w:szCs w:val="20"/>
-        </w:rPr>
-        <w:t xml:space="preserve">☐  </w:t>
-      </w:r>
-      <w:r>
-        <w:rPr>
-          <w:rFonts w:ascii="Arial" w:hAnsi="Arial" w:cs="Arial"/>
-          <w:sz w:val="20"/>
-          <w:szCs w:val="20"/>
-        </w:rPr>
-        <w:t xml:space="preserve">Zasadami przekazania smartfona na własność po zakończeniu udziału w projekcie.</w:t>
+          <w:sz w:val="20"/>
+          <w:szCs w:val="20"/>
+        </w:rPr>
+        <w:t>Potwierdzam zapoznanie się z:</w:t>
+      </w:r>
+    </w:p>
+    <w:p>
+      <w:pPr>
+        <w:spacing w:after="60"/>
+      </w:pPr>
+      <w:r>
+        <w:rPr>
+          <w:rFonts w:ascii="Arial" w:hAnsi="Arial" w:cs="Arial"/>
+          <w:sz w:val="20"/>
+          <w:szCs w:val="20"/>
+        </w:rPr>
+        <w:t>☐  Regulaminem rekrutacji i uczestnictwa w projekcie.</w:t>
+      </w:r>
+    </w:p>
+    <w:p>
+      <w:pPr>
+        <w:spacing w:after="60"/>
+      </w:pPr>
+      <w:r>
+        <w:rPr>
+          <w:rFonts w:ascii="Arial" w:hAnsi="Arial" w:cs="Arial"/>
+          <w:sz w:val="20"/>
+          <w:szCs w:val="20"/>
+        </w:rPr>
+        <w:t>☐  Zasadami przekazania smartfona na własność po zakończeniu udziału w projekcie.</w:t>
       </w:r>
     </w:p>
     <w:p>
@@ -1761,41 +1437,39 @@
       <w:r>
         <w:rPr>
           <w:rFonts w:ascii="Arial" w:hAnsi="Arial" w:cs="Arial"/>
-          <w:sz w:val="24"/>
-          <w:szCs w:val="24"/>
           <w:b/>
           <w:bCs/>
           <w:color w:val="2F5496"/>
         </w:rPr>
-        <w:t xml:space="preserve">SEKCJA E: KLAUZULA INFORMACYJNA RODO</w:t>
-      </w:r>
-    </w:p>
-    <w:p>
-      <w:pPr>
-        <w:spacing w:after="120" w:before="0"/>
-      </w:pPr>
-      <w:r>
-        <w:rPr>
-          <w:rFonts w:ascii="Arial" w:hAnsi="Arial" w:cs="Arial"/>
-          <w:sz w:val="20"/>
-          <w:szCs w:val="20"/>
+        <w:t>SEKCJA E: KLAUZULA INFORMACYJNA RODO</w:t>
+      </w:r>
+    </w:p>
+    <w:p>
+      <w:pPr>
+        <w:spacing w:after="120"/>
+      </w:pPr>
+      <w:r>
+        <w:rPr>
+          <w:rFonts w:ascii="Arial" w:hAnsi="Arial" w:cs="Arial"/>
           <w:i/>
           <w:iCs/>
-        </w:rPr>
-        <w:t xml:space="preserve">Zgodnie z art. 13 ust. 1 i 2 Rozporządzenia Parlamentu Europejskiego i Rady (UE) 2016/679 z dnia 27 kwietnia 2016 r. (RODO), informuję:</w:t>
-      </w:r>
-    </w:p>
-    <w:p>
-      <w:pPr>
-        <w:spacing w:after="80" w:before="0"/>
-      </w:pPr>
-      <w:r>
-        <w:rPr>
-          <w:rFonts w:ascii="Arial" w:hAnsi="Arial" w:cs="Arial"/>
-          <w:sz w:val="20"/>
-          <w:szCs w:val="20"/>
+          <w:sz w:val="20"/>
+          <w:szCs w:val="20"/>
+        </w:rPr>
+        <w:t>Zgodnie z art. 13 ust. 1 i 2 Rozporządzenia Parlamentu Europejskiego i Rady (UE) 2016/679 z dnia 27 kwietnia 2016 r. (RODO), informuję:</w:t>
+      </w:r>
+    </w:p>
+    <w:p>
+      <w:pPr>
+        <w:spacing w:after="80"/>
+      </w:pPr>
+      <w:r>
+        <w:rPr>
+          <w:rFonts w:ascii="Arial" w:hAnsi="Arial" w:cs="Arial"/>
           <w:b/>
           <w:bCs/>
+          <w:sz w:val="20"/>
+          <w:szCs w:val="20"/>
         </w:rPr>
         <w:t xml:space="preserve">1. Administrator danych: </w:t>
       </w:r>
@@ -1805,20 +1479,20 @@
           <w:sz w:val="20"/>
           <w:szCs w:val="20"/>
         </w:rPr>
-        <w:t xml:space="preserve">Stowarzyszenie na Rzecz Edukacji „Pomost”, ul. Okrężna 3, 66-200 Świebodzin, e-mail: stowarzyszenie@naszpomost.pl, tel. 512 945 580.</w:t>
-      </w:r>
-    </w:p>
-    <w:p>
-      <w:pPr>
-        <w:spacing w:after="80" w:before="0"/>
-      </w:pPr>
-      <w:r>
-        <w:rPr>
-          <w:rFonts w:ascii="Arial" w:hAnsi="Arial" w:cs="Arial"/>
-          <w:sz w:val="20"/>
-          <w:szCs w:val="20"/>
+        <w:t>Stowarzyszenie na Rzecz Edukacji „Pomost”, ul. Okrężna 3, 66-200 Świebodzin, e-mail: stowarzyszenie@naszpomost.pl, tel. 512 945 580.</w:t>
+      </w:r>
+    </w:p>
+    <w:p>
+      <w:pPr>
+        <w:spacing w:after="80"/>
+      </w:pPr>
+      <w:r>
+        <w:rPr>
+          <w:rFonts w:ascii="Arial" w:hAnsi="Arial" w:cs="Arial"/>
           <w:b/>
           <w:bCs/>
+          <w:sz w:val="20"/>
+          <w:szCs w:val="20"/>
         </w:rPr>
         <w:t xml:space="preserve">2. Cel przetwarzania: </w:t>
       </w:r>
@@ -1828,20 +1502,20 @@
           <w:sz w:val="20"/>
           <w:szCs w:val="20"/>
         </w:rPr>
-        <w:t xml:space="preserve">rekrutacja, realizacja, monitoring, ewaluacja i rozliczanie projektu „Smartfon w akcji – rozwój umiejętności podstawowych dorosłych Lubuszan” (FELB.06.08-IZ.00-0004/25) współfinansowanego ze środków Unii Europejskiej.</w:t>
-      </w:r>
-    </w:p>
-    <w:p>
-      <w:pPr>
-        <w:spacing w:after="80" w:before="0"/>
-      </w:pPr>
-      <w:r>
-        <w:rPr>
-          <w:rFonts w:ascii="Arial" w:hAnsi="Arial" w:cs="Arial"/>
-          <w:sz w:val="20"/>
-          <w:szCs w:val="20"/>
+        <w:t>rekrutacja, realizacja, monitoring, ewaluacja i rozliczanie projektu „Smartfon w akcji – rozwój umiejętności podstawowych dorosłych Lubuszan” (FELB.06.08-IZ.00-0004/25) współfinansowanego ze środków Unii Europejskiej.</w:t>
+      </w:r>
+    </w:p>
+    <w:p>
+      <w:pPr>
+        <w:spacing w:after="80"/>
+      </w:pPr>
+      <w:r>
+        <w:rPr>
+          <w:rFonts w:ascii="Arial" w:hAnsi="Arial" w:cs="Arial"/>
           <w:b/>
           <w:bCs/>
+          <w:sz w:val="20"/>
+          <w:szCs w:val="20"/>
         </w:rPr>
         <w:t xml:space="preserve">3. Podstawa prawna: </w:t>
       </w:r>
@@ -1851,20 +1525,20 @@
           <w:sz w:val="20"/>
           <w:szCs w:val="20"/>
         </w:rPr>
-        <w:t xml:space="preserve">art. 6 ust. 1 lit. a), b), c) RODO – zgoda, wykonanie umowy, obowiązek prawny wynikający z przepisów dot. funduszy europejskich.</w:t>
-      </w:r>
-    </w:p>
-    <w:p>
-      <w:pPr>
-        <w:spacing w:after="80" w:before="0"/>
-      </w:pPr>
-      <w:r>
-        <w:rPr>
-          <w:rFonts w:ascii="Arial" w:hAnsi="Arial" w:cs="Arial"/>
-          <w:sz w:val="20"/>
-          <w:szCs w:val="20"/>
+        <w:t>art. 6 ust. 1 lit. a), b), c) RODO – zgoda, wykonanie umowy, obowiązek prawny wynikający z przepisów dot. funduszy europejskich.</w:t>
+      </w:r>
+    </w:p>
+    <w:p>
+      <w:pPr>
+        <w:spacing w:after="80"/>
+      </w:pPr>
+      <w:r>
+        <w:rPr>
+          <w:rFonts w:ascii="Arial" w:hAnsi="Arial" w:cs="Arial"/>
           <w:b/>
           <w:bCs/>
+          <w:sz w:val="20"/>
+          <w:szCs w:val="20"/>
         </w:rPr>
         <w:t xml:space="preserve">4. Odbiorcy danych: </w:t>
       </w:r>
@@ -1874,20 +1548,20 @@
           <w:sz w:val="20"/>
           <w:szCs w:val="20"/>
         </w:rPr>
-        <w:t xml:space="preserve">Urząd Marszałkowski Województwa Lubuskiego (Instytucja Zarządzająca), minister ds. rozwoju regionalnego, podmioty upoważnione na podstawie przepisów prawa, podmioty świadczące usługi na rzecz Administratora.</w:t>
-      </w:r>
-    </w:p>
-    <w:p>
-      <w:pPr>
-        <w:spacing w:after="80" w:before="0"/>
-      </w:pPr>
-      <w:r>
-        <w:rPr>
-          <w:rFonts w:ascii="Arial" w:hAnsi="Arial" w:cs="Arial"/>
-          <w:sz w:val="20"/>
-          <w:szCs w:val="20"/>
+        <w:t>Urząd Marszałkowski Województwa Lubuskiego (Instytucja Zarządzająca), minister ds. rozwoju regionalnego, podmioty upoważnione na podstawie przepisów prawa, podmioty świadczące usługi na rzecz Administratora.</w:t>
+      </w:r>
+    </w:p>
+    <w:p>
+      <w:pPr>
+        <w:spacing w:after="80"/>
+      </w:pPr>
+      <w:r>
+        <w:rPr>
+          <w:rFonts w:ascii="Arial" w:hAnsi="Arial" w:cs="Arial"/>
           <w:b/>
           <w:bCs/>
+          <w:sz w:val="20"/>
+          <w:szCs w:val="20"/>
         </w:rPr>
         <w:t xml:space="preserve">5. Okres przechowywania: </w:t>
       </w:r>
@@ -1897,20 +1571,20 @@
           <w:sz w:val="20"/>
           <w:szCs w:val="20"/>
         </w:rPr>
-        <w:t xml:space="preserve">przez okres realizacji projektu oraz wymagany przepisami archiwizacji (minimum do 31.12.2034 r.).</w:t>
-      </w:r>
-    </w:p>
-    <w:p>
-      <w:pPr>
-        <w:spacing w:after="80" w:before="0"/>
-      </w:pPr>
-      <w:r>
-        <w:rPr>
-          <w:rFonts w:ascii="Arial" w:hAnsi="Arial" w:cs="Arial"/>
-          <w:sz w:val="20"/>
-          <w:szCs w:val="20"/>
+        <w:t>przez okres realizacji projektu oraz wymagany przepisami archiwizacji (minimum do 31.12.2034 r.).</w:t>
+      </w:r>
+    </w:p>
+    <w:p>
+      <w:pPr>
+        <w:spacing w:after="80"/>
+      </w:pPr>
+      <w:r>
+        <w:rPr>
+          <w:rFonts w:ascii="Arial" w:hAnsi="Arial" w:cs="Arial"/>
           <w:b/>
           <w:bCs/>
+          <w:sz w:val="20"/>
+          <w:szCs w:val="20"/>
         </w:rPr>
         <w:t xml:space="preserve">6. Prawa: </w:t>
       </w:r>
@@ -1920,20 +1594,20 @@
           <w:sz w:val="20"/>
           <w:szCs w:val="20"/>
         </w:rPr>
-        <w:t xml:space="preserve">prawo dostępu do danych, ich sprostowania, usunięcia, ograniczenia przetwarzania, przenoszenia, wniesienia sprzeciwu oraz cofnięcia zgody w dowolnym momencie (bez wpływu na zgodność z prawem przetwarzania dokonanego przed cofnięciem).</w:t>
-      </w:r>
-    </w:p>
-    <w:p>
-      <w:pPr>
-        <w:spacing w:after="80" w:before="0"/>
-      </w:pPr>
-      <w:r>
-        <w:rPr>
-          <w:rFonts w:ascii="Arial" w:hAnsi="Arial" w:cs="Arial"/>
-          <w:sz w:val="20"/>
-          <w:szCs w:val="20"/>
+        <w:t>prawo dostępu do danych, ich sprostowania, usunięcia, ograniczenia przetwarzania, przenoszenia, wniesienia sprzeciwu oraz cofnięcia zgody w dowolnym momencie (bez wpływu na zgodność z prawem przetwarzania dokonanego przed cofnięciem).</w:t>
+      </w:r>
+    </w:p>
+    <w:p>
+      <w:pPr>
+        <w:spacing w:after="80"/>
+      </w:pPr>
+      <w:r>
+        <w:rPr>
+          <w:rFonts w:ascii="Arial" w:hAnsi="Arial" w:cs="Arial"/>
           <w:b/>
           <w:bCs/>
+          <w:sz w:val="20"/>
+          <w:szCs w:val="20"/>
         </w:rPr>
         <w:t xml:space="preserve">7. Skarga: </w:t>
       </w:r>
@@ -1943,20 +1617,20 @@
           <w:sz w:val="20"/>
           <w:szCs w:val="20"/>
         </w:rPr>
-        <w:t xml:space="preserve">prawo do wniesienia skargi do Prezesa Urzędu Ochrony Danych Osobowych (ul. Stawki 2, 00-193 Warszawa).</w:t>
-      </w:r>
-    </w:p>
-    <w:p>
-      <w:pPr>
-        <w:spacing w:after="80" w:before="0"/>
-      </w:pPr>
-      <w:r>
-        <w:rPr>
-          <w:rFonts w:ascii="Arial" w:hAnsi="Arial" w:cs="Arial"/>
-          <w:sz w:val="20"/>
-          <w:szCs w:val="20"/>
+        <w:t>prawo do wniesienia skargi do Prezesa Urzędu Ochrony Danych Osobowych (ul. Stawki 2, 00-193 Warszawa).</w:t>
+      </w:r>
+    </w:p>
+    <w:p>
+      <w:pPr>
+        <w:spacing w:after="80"/>
+      </w:pPr>
+      <w:r>
+        <w:rPr>
+          <w:rFonts w:ascii="Arial" w:hAnsi="Arial" w:cs="Arial"/>
           <w:b/>
           <w:bCs/>
+          <w:sz w:val="20"/>
+          <w:szCs w:val="20"/>
         </w:rPr>
         <w:t xml:space="preserve">8. Podanie danych: </w:t>
       </w:r>
@@ -1966,7 +1640,7 @@
           <w:sz w:val="20"/>
           <w:szCs w:val="20"/>
         </w:rPr>
-        <w:t xml:space="preserve">jest dobrowolne, lecz niezbędne do udziału w projekcie. Odmowa uniemożliwia uczestnictwo.</w:t>
+        <w:t>jest dobrowolne, lecz niezbędne do udziału w projekcie. Odmowa uniemożliwia uczestnictwo.</w:t>
       </w:r>
     </w:p>
     <w:p>
@@ -1979,49 +1653,39 @@
       <w:r>
         <w:rPr>
           <w:rFonts w:ascii="Arial" w:hAnsi="Arial" w:cs="Arial"/>
-          <w:sz w:val="24"/>
-          <w:szCs w:val="24"/>
           <w:b/>
           <w:bCs/>
           <w:color w:val="2F5496"/>
         </w:rPr>
-        <w:t xml:space="preserve">SEKCJA F: ZGODY</w:t>
-      </w:r>
-    </w:p>
-    <w:p>
-      <w:pPr>
-        <w:spacing w:after="120" w:before="0"/>
-      </w:pPr>
-      <w:r>
-        <w:rPr>
-          <w:rFonts w:ascii="Arial" w:hAnsi="Arial" w:cs="Arial"/>
-          <w:sz w:val="20"/>
-          <w:szCs w:val="20"/>
+        <w:t>SEKCJA F: ZGODY</w:t>
+      </w:r>
+    </w:p>
+    <w:p>
+      <w:pPr>
+        <w:spacing w:after="120"/>
+      </w:pPr>
+      <w:r>
+        <w:rPr>
+          <w:rFonts w:ascii="Arial" w:hAnsi="Arial" w:cs="Arial"/>
           <w:b/>
           <w:bCs/>
-        </w:rPr>
-        <w:t xml:space="preserve">Proszę zaznaczyć każdą zgodę:</w:t>
-      </w:r>
-    </w:p>
-    <w:p>
-      <w:pPr>
-        <w:spacing w:after="60" w:before="0"/>
-      </w:pPr>
-      <w:r>
-        <w:rPr>
-          <w:rFonts w:ascii="Arial" w:hAnsi="Arial" w:cs="Arial"/>
-          <w:sz w:val="20"/>
-          <w:szCs w:val="20"/>
-        </w:rPr>
-        <w:t xml:space="preserve">☐  </w:t>
-      </w:r>
-      <w:r>
-        <w:rPr>
-          <w:rFonts w:ascii="Arial" w:hAnsi="Arial" w:cs="Arial"/>
-          <w:sz w:val="20"/>
-          <w:szCs w:val="20"/>
-        </w:rPr>
-        <w:t xml:space="preserve">Wyrażam zgodę na przetwarzanie moich danych osobowych zawartych w niniejszym formularzu w zakresie niezbędnym do realizacji projektu, zgodnie z klauzulą informacyjną (Sekcja E).</w:t>
+          <w:sz w:val="20"/>
+          <w:szCs w:val="20"/>
+        </w:rPr>
+        <w:t>Proszę zaznaczyć każdą zgodę:</w:t>
+      </w:r>
+    </w:p>
+    <w:p>
+      <w:pPr>
+        <w:spacing w:after="60"/>
+      </w:pPr>
+      <w:r>
+        <w:rPr>
+          <w:rFonts w:ascii="Arial" w:hAnsi="Arial" w:cs="Arial"/>
+          <w:sz w:val="20"/>
+          <w:szCs w:val="20"/>
+        </w:rPr>
+        <w:t>☐  Wyrażam zgodę na przetwarzanie moich danych osobowych zawartych w niniejszym formularzu w zakresie niezbędnym do realizacji projektu, zgodnie z klauzulą informacyjną (Sekcja E).</w:t>
       </w:r>
     </w:p>
     <w:p>
@@ -2031,23 +1695,15 @@
     </w:p>
     <w:p>
       <w:pPr>
-        <w:spacing w:after="60" w:before="0"/>
-      </w:pPr>
-      <w:r>
-        <w:rPr>
-          <w:rFonts w:ascii="Arial" w:hAnsi="Arial" w:cs="Arial"/>
-          <w:sz w:val="20"/>
-          <w:szCs w:val="20"/>
-        </w:rPr>
-        <w:t xml:space="preserve">☐  </w:t>
-      </w:r>
-      <w:r>
-        <w:rPr>
-          <w:rFonts w:ascii="Arial" w:hAnsi="Arial" w:cs="Arial"/>
-          <w:sz w:val="20"/>
-          <w:szCs w:val="20"/>
-        </w:rPr>
-        <w:t xml:space="preserve">Wyrażam zgodę na przetwarzanie moich danych osobowych w zakresie określonym w załączniku nr 4 do umowy o dofinansowanie (zakres danych nt. uczestników projektu) oraz na przekazanie danych do systemu CST2021.</w:t>
+        <w:spacing w:after="60"/>
+      </w:pPr>
+      <w:r>
+        <w:rPr>
+          <w:rFonts w:ascii="Arial" w:hAnsi="Arial" w:cs="Arial"/>
+          <w:sz w:val="20"/>
+          <w:szCs w:val="20"/>
+        </w:rPr>
+        <w:t>☐  Wyrażam zgodę na przetwarzanie moich danych osobowych w zakresie określonym w załączniku nr 4 do umowy o dofinansowanie (zakres danych nt. uczestników projektu) oraz na przekazanie danych do systemu CST2021.</w:t>
       </w:r>
     </w:p>
     <w:p>
@@ -2057,23 +1713,16 @@
     </w:p>
     <w:p>
       <w:pPr>
-        <w:spacing w:after="60" w:before="0"/>
-      </w:pPr>
-      <w:r>
-        <w:rPr>
-          <w:rFonts w:ascii="Arial" w:hAnsi="Arial" w:cs="Arial"/>
-          <w:sz w:val="20"/>
-          <w:szCs w:val="20"/>
-        </w:rPr>
-        <w:t xml:space="preserve">☐  </w:t>
-      </w:r>
-      <w:r>
-        <w:rPr>
-          <w:rFonts w:ascii="Arial" w:hAnsi="Arial" w:cs="Arial"/>
-          <w:sz w:val="20"/>
-          <w:szCs w:val="20"/>
-        </w:rPr>
-        <w:t xml:space="preserve">Wyrażam zgodę na nieodpłatne wykorzystanie mojego wizerunku (zdjęcia, nagrania) utrwalonego podczas udziału w projekcie, w celach informacyjnych i promocyjnych projektu, w tym na stronie www, mediach społecznościowych i materiałach drukowanych.</w:t>
+        <w:spacing w:after="60"/>
+      </w:pPr>
+      <w:r>
+        <w:rPr>
+          <w:rFonts w:ascii="Arial" w:hAnsi="Arial" w:cs="Arial"/>
+          <w:sz w:val="20"/>
+          <w:szCs w:val="20"/>
+        </w:rPr>
+        <w:lastRenderedPageBreak/>
+        <w:t>☐  Wyrażam zgodę na nieodpłatne wykorzystanie mojego wizerunku (zdjęcia, nagrania) utrwalonego podczas udziału w projekcie, w celach informacyjnych i promocyjnych projektu, w tym na stronie www, mediach społecznościowych i materiałach drukowanych.</w:t>
       </w:r>
     </w:p>
     <w:p>
@@ -2083,40 +1732,32 @@
     </w:p>
     <w:p>
       <w:pPr>
-        <w:spacing w:after="80" w:before="0"/>
-      </w:pPr>
-      <w:r>
-        <w:rPr>
-          <w:rFonts w:ascii="Arial" w:hAnsi="Arial" w:cs="Arial"/>
-          <w:sz w:val="20"/>
-          <w:szCs w:val="20"/>
+        <w:spacing w:after="80"/>
+      </w:pPr>
+      <w:r>
+        <w:rPr>
+          <w:rFonts w:ascii="Arial" w:hAnsi="Arial" w:cs="Arial"/>
           <w:b/>
           <w:bCs/>
           <w:i/>
           <w:iCs/>
-        </w:rPr>
-        <w:t xml:space="preserve">Zgoda opcjonalna:</w:t>
-      </w:r>
-    </w:p>
-    <w:p>
-      <w:pPr>
-        <w:spacing w:after="60" w:before="0"/>
-      </w:pPr>
-      <w:r>
-        <w:rPr>
-          <w:rFonts w:ascii="Arial" w:hAnsi="Arial" w:cs="Arial"/>
-          <w:sz w:val="20"/>
-          <w:szCs w:val="20"/>
-        </w:rPr>
-        <w:t xml:space="preserve">☐  </w:t>
-      </w:r>
-      <w:r>
-        <w:rPr>
-          <w:rFonts w:ascii="Arial" w:hAnsi="Arial" w:cs="Arial"/>
-          <w:sz w:val="20"/>
-          <w:szCs w:val="20"/>
-        </w:rPr>
-        <w:t xml:space="preserve">Wyrażam zgodę na kontakt telefoniczny i mailowy w sprawach związanych z realizacją projektu oraz informowania o przyszłych działaniach edukacyjnych Stowarzyszenia.</w:t>
+          <w:sz w:val="20"/>
+          <w:szCs w:val="20"/>
+        </w:rPr>
+        <w:t>Zgoda opcjonalna:</w:t>
+      </w:r>
+    </w:p>
+    <w:p>
+      <w:pPr>
+        <w:spacing w:after="60"/>
+      </w:pPr>
+      <w:r>
+        <w:rPr>
+          <w:rFonts w:ascii="Arial" w:hAnsi="Arial" w:cs="Arial"/>
+          <w:sz w:val="20"/>
+          <w:szCs w:val="20"/>
+        </w:rPr>
+        <w:t>☐  Wyrażam zgodę na kontakt telefoniczny i mailowy w sprawach związanych z realizacją projektu oraz informowania o przyszłych działaniach edukacyjnych Stowarzyszenia.</w:t>
       </w:r>
     </w:p>
     <w:p>
@@ -2134,97 +1775,87 @@
       <w:r>
         <w:rPr>
           <w:rFonts w:ascii="Arial" w:hAnsi="Arial" w:cs="Arial"/>
-          <w:sz w:val="24"/>
-          <w:szCs w:val="24"/>
           <w:b/>
           <w:bCs/>
           <w:color w:val="2F5496"/>
         </w:rPr>
-        <w:t xml:space="preserve">SEKCJA G: OPIEKA NAD OSOBĄ ZALEŻNĄ (jeśli dotyczy)</w:t>
-      </w:r>
-    </w:p>
-    <w:p>
-      <w:pPr>
-        <w:spacing w:after="100" w:before="0"/>
-      </w:pPr>
-      <w:r>
-        <w:rPr>
-          <w:rFonts w:ascii="Arial" w:hAnsi="Arial" w:cs="Arial"/>
-          <w:sz w:val="20"/>
-          <w:szCs w:val="20"/>
+        <w:t>SEKCJA G: OPIEKA NAD OSOBĄ ZALEŻNĄ (jeśli dotyczy)</w:t>
+      </w:r>
+    </w:p>
+    <w:p>
+      <w:pPr>
+        <w:spacing w:after="100"/>
+      </w:pPr>
+      <w:r>
+        <w:rPr>
+          <w:rFonts w:ascii="Arial" w:hAnsi="Arial" w:cs="Arial"/>
           <w:i/>
           <w:iCs/>
-        </w:rPr>
-        <w:t xml:space="preserve">Wypełnić TYLKO w przypadku potrzeby zapewnienia opieki nad osobą zależną w trakcie udziału w zajęciach:</w:t>
-      </w:r>
-    </w:p>
-    <w:p>
-      <w:pPr>
-        <w:spacing w:after="60" w:before="0"/>
-      </w:pPr>
-      <w:r>
-        <w:rPr>
-          <w:rFonts w:ascii="Arial" w:hAnsi="Arial" w:cs="Arial"/>
-          <w:sz w:val="20"/>
-          <w:szCs w:val="20"/>
-        </w:rPr>
-        <w:t xml:space="preserve">☐  </w:t>
-      </w:r>
-      <w:r>
-        <w:rPr>
-          <w:rFonts w:ascii="Arial" w:hAnsi="Arial" w:cs="Arial"/>
-          <w:sz w:val="20"/>
-          <w:szCs w:val="20"/>
-        </w:rPr>
-        <w:t xml:space="preserve">Potrzebuję wsparcia w zakresie opieki nad osobą zależną (dziecko / osoba starsza / osoba z niepełnosprawnością) w trakcie udziału w zajęciach projektowych.</w:t>
-      </w:r>
-    </w:p>
-    <w:p>
-      <w:pPr>
-        <w:spacing w:after="80" w:before="0"/>
-      </w:pPr>
-      <w:r>
-        <w:rPr>
-          <w:rFonts w:ascii="Arial" w:hAnsi="Arial" w:cs="Arial"/>
-          <w:sz w:val="20"/>
-          <w:szCs w:val="20"/>
+          <w:sz w:val="20"/>
+          <w:szCs w:val="20"/>
+        </w:rPr>
+        <w:t>Wypełnić TYLKO w przypadku potrzeby zapewnienia opieki nad osobą zależną w trakcie udziału w zajęciach:</w:t>
+      </w:r>
+    </w:p>
+    <w:p>
+      <w:pPr>
+        <w:spacing w:after="60"/>
+      </w:pPr>
+      <w:r>
+        <w:rPr>
+          <w:rFonts w:ascii="Arial" w:hAnsi="Arial" w:cs="Arial"/>
+          <w:sz w:val="20"/>
+          <w:szCs w:val="20"/>
+        </w:rPr>
+        <w:t>☐  Potrzebuję wsparcia w zakresie opieki nad osobą zależną (dziecko / osoba starsza / osoba z niepełnosprawnością) w trakcie udziału w zajęciach projektowych.</w:t>
+      </w:r>
+    </w:p>
+    <w:p>
+      <w:pPr>
+        <w:spacing w:after="80"/>
+      </w:pPr>
+      <w:r>
+        <w:rPr>
+          <w:rFonts w:ascii="Arial" w:hAnsi="Arial" w:cs="Arial"/>
           <w:b/>
           <w:bCs/>
+          <w:sz w:val="20"/>
+          <w:szCs w:val="20"/>
         </w:rPr>
         <w:t xml:space="preserve">Opis sytuacji </w:t>
       </w:r>
       <w:r>
         <w:rPr>
           <w:rFonts w:ascii="Arial" w:hAnsi="Arial" w:cs="Arial"/>
-          <w:sz w:val="20"/>
-          <w:szCs w:val="20"/>
           <w:color w:val="AAAAAA"/>
-        </w:rPr>
-        <w:t xml:space="preserve">............................................................</w:t>
-      </w:r>
-    </w:p>
-    <w:p>
-      <w:pPr>
-        <w:spacing w:after="80" w:before="0"/>
-      </w:pPr>
-      <w:r>
-        <w:rPr>
-          <w:rFonts w:ascii="Arial" w:hAnsi="Arial" w:cs="Arial"/>
-          <w:sz w:val="20"/>
-          <w:szCs w:val="20"/>
+          <w:sz w:val="20"/>
+          <w:szCs w:val="20"/>
+        </w:rPr>
+        <w:t>............................................................</w:t>
+      </w:r>
+    </w:p>
+    <w:p>
+      <w:pPr>
+        <w:spacing w:after="80"/>
+      </w:pPr>
+      <w:r>
+        <w:rPr>
+          <w:rFonts w:ascii="Arial" w:hAnsi="Arial" w:cs="Arial"/>
           <w:b/>
           <w:bCs/>
+          <w:sz w:val="20"/>
+          <w:szCs w:val="20"/>
         </w:rPr>
         <w:t xml:space="preserve"> </w:t>
       </w:r>
       <w:r>
         <w:rPr>
           <w:rFonts w:ascii="Arial" w:hAnsi="Arial" w:cs="Arial"/>
-          <w:sz w:val="20"/>
-          <w:szCs w:val="20"/>
           <w:color w:val="AAAAAA"/>
-        </w:rPr>
-        <w:t xml:space="preserve">............................................................</w:t>
+          <w:sz w:val="20"/>
+          <w:szCs w:val="20"/>
+        </w:rPr>
+        <w:t>............................................................</w:t>
       </w:r>
     </w:p>
     <w:p>
@@ -2242,180 +1873,117 @@
       <w:r>
         <w:rPr>
           <w:rFonts w:ascii="Arial" w:hAnsi="Arial" w:cs="Arial"/>
-          <w:sz w:val="24"/>
-          <w:szCs w:val="24"/>
           <w:b/>
           <w:bCs/>
           <w:color w:val="2F5496"/>
         </w:rPr>
-        <w:t xml:space="preserve">SEKCJA H: ŹRÓDŁO INFORMACJI O PROJEKCIE</w:t>
-      </w:r>
-    </w:p>
-    <w:p>
-      <w:pPr>
-        <w:spacing w:after="100" w:before="0"/>
-      </w:pPr>
-      <w:r>
-        <w:rPr>
-          <w:rFonts w:ascii="Arial" w:hAnsi="Arial" w:cs="Arial"/>
-          <w:sz w:val="20"/>
-          <w:szCs w:val="20"/>
+        <w:t>SEKCJA H: ŹRÓDŁO INFORMACJI O PROJEKCIE</w:t>
+      </w:r>
+    </w:p>
+    <w:p>
+      <w:pPr>
+        <w:spacing w:after="100"/>
+      </w:pPr>
+      <w:r>
+        <w:rPr>
+          <w:rFonts w:ascii="Arial" w:hAnsi="Arial" w:cs="Arial"/>
           <w:b/>
           <w:bCs/>
-        </w:rPr>
-        <w:t xml:space="preserve">Skąd dowiedziałem/am się o projekcie?</w:t>
-      </w:r>
-    </w:p>
-    <w:p>
-      <w:pPr>
-        <w:spacing w:after="60" w:before="0"/>
-      </w:pPr>
-      <w:r>
-        <w:rPr>
-          <w:rFonts w:ascii="Arial" w:hAnsi="Arial" w:cs="Arial"/>
-          <w:sz w:val="20"/>
-          <w:szCs w:val="20"/>
-        </w:rPr>
-        <w:t xml:space="preserve">☐  </w:t>
-      </w:r>
-      <w:r>
-        <w:rPr>
-          <w:rFonts w:ascii="Arial" w:hAnsi="Arial" w:cs="Arial"/>
-          <w:sz w:val="20"/>
-          <w:szCs w:val="20"/>
-        </w:rPr>
-        <w:t xml:space="preserve">Strona internetowa (www.naszpomost.pl)</w:t>
-      </w:r>
-    </w:p>
-    <w:p>
-      <w:pPr>
-        <w:spacing w:after="60" w:before="0"/>
-      </w:pPr>
-      <w:r>
-        <w:rPr>
-          <w:rFonts w:ascii="Arial" w:hAnsi="Arial" w:cs="Arial"/>
-          <w:sz w:val="20"/>
-          <w:szCs w:val="20"/>
-        </w:rPr>
-        <w:t xml:space="preserve">☐  </w:t>
-      </w:r>
-      <w:r>
-        <w:rPr>
-          <w:rFonts w:ascii="Arial" w:hAnsi="Arial" w:cs="Arial"/>
-          <w:sz w:val="20"/>
-          <w:szCs w:val="20"/>
-        </w:rPr>
-        <w:t xml:space="preserve">Media społecznościowe (Facebook, X)</w:t>
-      </w:r>
-    </w:p>
-    <w:p>
-      <w:pPr>
-        <w:spacing w:after="60" w:before="0"/>
-      </w:pPr>
-      <w:r>
-        <w:rPr>
-          <w:rFonts w:ascii="Arial" w:hAnsi="Arial" w:cs="Arial"/>
-          <w:sz w:val="20"/>
-          <w:szCs w:val="20"/>
-        </w:rPr>
-        <w:t xml:space="preserve">☐  </w:t>
-      </w:r>
-      <w:r>
-        <w:rPr>
-          <w:rFonts w:ascii="Arial" w:hAnsi="Arial" w:cs="Arial"/>
-          <w:sz w:val="20"/>
-          <w:szCs w:val="20"/>
-        </w:rPr>
-        <w:t xml:space="preserve">Ulotka / plakat</w:t>
-      </w:r>
-    </w:p>
-    <w:p>
-      <w:pPr>
-        <w:spacing w:after="60" w:before="0"/>
-      </w:pPr>
-      <w:r>
-        <w:rPr>
-          <w:rFonts w:ascii="Arial" w:hAnsi="Arial" w:cs="Arial"/>
-          <w:sz w:val="20"/>
-          <w:szCs w:val="20"/>
-        </w:rPr>
-        <w:t xml:space="preserve">☐  </w:t>
-      </w:r>
-      <w:r>
-        <w:rPr>
-          <w:rFonts w:ascii="Arial" w:hAnsi="Arial" w:cs="Arial"/>
-          <w:sz w:val="20"/>
-          <w:szCs w:val="20"/>
-        </w:rPr>
-        <w:t xml:space="preserve">Parafia / kościół</w:t>
-      </w:r>
-    </w:p>
-    <w:p>
-      <w:pPr>
-        <w:spacing w:after="60" w:before="0"/>
-      </w:pPr>
-      <w:r>
-        <w:rPr>
-          <w:rFonts w:ascii="Arial" w:hAnsi="Arial" w:cs="Arial"/>
-          <w:sz w:val="20"/>
-          <w:szCs w:val="20"/>
-        </w:rPr>
-        <w:t xml:space="preserve">☐  </w:t>
-      </w:r>
-      <w:r>
-        <w:rPr>
-          <w:rFonts w:ascii="Arial" w:hAnsi="Arial" w:cs="Arial"/>
-          <w:sz w:val="20"/>
-          <w:szCs w:val="20"/>
-        </w:rPr>
-        <w:t xml:space="preserve">OPS / PUP / urząd gminy</w:t>
-      </w:r>
-    </w:p>
-    <w:p>
-      <w:pPr>
-        <w:spacing w:after="60" w:before="0"/>
-      </w:pPr>
-      <w:r>
-        <w:rPr>
-          <w:rFonts w:ascii="Arial" w:hAnsi="Arial" w:cs="Arial"/>
-          <w:sz w:val="20"/>
-          <w:szCs w:val="20"/>
-        </w:rPr>
-        <w:t xml:space="preserve">☐  </w:t>
-      </w:r>
-      <w:r>
-        <w:rPr>
-          <w:rFonts w:ascii="Arial" w:hAnsi="Arial" w:cs="Arial"/>
-          <w:sz w:val="20"/>
-          <w:szCs w:val="20"/>
-        </w:rPr>
-        <w:t xml:space="preserve">Znajomi / rodzina</w:t>
-      </w:r>
-    </w:p>
-    <w:p>
-      <w:pPr>
-        <w:spacing w:after="60" w:before="0"/>
-      </w:pPr>
-      <w:r>
-        <w:rPr>
-          <w:rFonts w:ascii="Arial" w:hAnsi="Arial" w:cs="Arial"/>
-          <w:sz w:val="20"/>
-          <w:szCs w:val="20"/>
-        </w:rPr>
-        <w:t xml:space="preserve">☐  </w:t>
-      </w:r>
-      <w:r>
-        <w:rPr>
-          <w:rFonts w:ascii="Arial" w:hAnsi="Arial" w:cs="Arial"/>
-          <w:sz w:val="20"/>
-          <w:szCs w:val="20"/>
-        </w:rPr>
-        <w:t xml:space="preserve">Inne: .....................................................</w:t>
-      </w:r>
-    </w:p>
-    <w:p>
-      <w:r>
-        <w:br w:type="page"/>
+          <w:sz w:val="20"/>
+          <w:szCs w:val="20"/>
+        </w:rPr>
+        <w:t>Skąd dowiedziałem/am się o projekcie?</w:t>
+      </w:r>
+    </w:p>
+    <w:p>
+      <w:pPr>
+        <w:spacing w:after="60"/>
+      </w:pPr>
+      <w:r>
+        <w:rPr>
+          <w:rFonts w:ascii="Arial" w:hAnsi="Arial" w:cs="Arial"/>
+          <w:sz w:val="20"/>
+          <w:szCs w:val="20"/>
+        </w:rPr>
+        <w:t>☐  Strona internetowa (www.naszpomost.pl)</w:t>
+      </w:r>
+    </w:p>
+    <w:p>
+      <w:pPr>
+        <w:spacing w:after="60"/>
+      </w:pPr>
+      <w:r>
+        <w:rPr>
+          <w:rFonts w:ascii="Arial" w:hAnsi="Arial" w:cs="Arial"/>
+          <w:sz w:val="20"/>
+          <w:szCs w:val="20"/>
+        </w:rPr>
+        <w:t>☐  Media społecznościowe (Facebook, X)</w:t>
+      </w:r>
+    </w:p>
+    <w:p>
+      <w:pPr>
+        <w:spacing w:after="60"/>
+      </w:pPr>
+      <w:r>
+        <w:rPr>
+          <w:rFonts w:ascii="Arial" w:hAnsi="Arial" w:cs="Arial"/>
+          <w:sz w:val="20"/>
+          <w:szCs w:val="20"/>
+        </w:rPr>
+        <w:t>☐  Ulotka / plakat</w:t>
+      </w:r>
+    </w:p>
+    <w:p>
+      <w:pPr>
+        <w:spacing w:after="60"/>
+      </w:pPr>
+      <w:r>
+        <w:rPr>
+          <w:rFonts w:ascii="Arial" w:hAnsi="Arial" w:cs="Arial"/>
+          <w:sz w:val="20"/>
+          <w:szCs w:val="20"/>
+        </w:rPr>
+        <w:t>☐  Parafia / kościół</w:t>
+      </w:r>
+    </w:p>
+    <w:p>
+      <w:pPr>
+        <w:spacing w:after="60"/>
+      </w:pPr>
+      <w:r>
+        <w:rPr>
+          <w:rFonts w:ascii="Arial" w:hAnsi="Arial" w:cs="Arial"/>
+          <w:sz w:val="20"/>
+          <w:szCs w:val="20"/>
+        </w:rPr>
+        <w:t>☐  OPS / PUP / urząd gminy</w:t>
+      </w:r>
+    </w:p>
+    <w:p>
+      <w:pPr>
+        <w:spacing w:after="60"/>
+      </w:pPr>
+      <w:r>
+        <w:rPr>
+          <w:rFonts w:ascii="Arial" w:hAnsi="Arial" w:cs="Arial"/>
+          <w:sz w:val="20"/>
+          <w:szCs w:val="20"/>
+        </w:rPr>
+        <w:t>☐  Znajomi / rodzina</w:t>
+      </w:r>
+    </w:p>
+    <w:p>
+      <w:pPr>
+        <w:spacing w:after="60"/>
+      </w:pPr>
+      <w:r>
+        <w:rPr>
+          <w:rFonts w:ascii="Arial" w:hAnsi="Arial" w:cs="Arial"/>
+          <w:sz w:val="20"/>
+          <w:szCs w:val="20"/>
+        </w:rPr>
+        <w:t>☐  Inne: .....................................................</w:t>
       </w:r>
     </w:p>
     <w:p>
@@ -2428,41 +1996,39 @@
       <w:r>
         <w:rPr>
           <w:rFonts w:ascii="Arial" w:hAnsi="Arial" w:cs="Arial"/>
-          <w:sz w:val="24"/>
-          <w:szCs w:val="24"/>
           <w:b/>
           <w:bCs/>
           <w:color w:val="2F5496"/>
         </w:rPr>
-        <w:t xml:space="preserve">PODPIS UCZESTNIKA/UCZESTNICZKI</w:t>
-      </w:r>
-    </w:p>
-    <w:p>
-      <w:pPr>
-        <w:spacing w:after="120" w:before="0"/>
-      </w:pPr>
-      <w:r>
-        <w:rPr>
-          <w:rFonts w:ascii="Arial" w:hAnsi="Arial" w:cs="Arial"/>
-          <w:sz w:val="20"/>
-          <w:szCs w:val="20"/>
+        <w:t>PODPIS UCZESTNIKA/UCZESTNICZKI</w:t>
+      </w:r>
+    </w:p>
+    <w:p>
+      <w:pPr>
+        <w:spacing w:after="120"/>
+      </w:pPr>
+      <w:r>
+        <w:rPr>
+          <w:rFonts w:ascii="Arial" w:hAnsi="Arial" w:cs="Arial"/>
           <w:b/>
           <w:bCs/>
-        </w:rPr>
-        <w:t xml:space="preserve">Składając poniższy podpis, potwierdzam że:</w:t>
-      </w:r>
-    </w:p>
-    <w:p>
-      <w:pPr>
-        <w:spacing w:after="60" w:before="0"/>
-      </w:pPr>
-      <w:r>
-        <w:rPr>
-          <w:rFonts w:ascii="Arial" w:hAnsi="Arial" w:cs="Arial"/>
-          <w:sz w:val="20"/>
-          <w:szCs w:val="20"/>
+          <w:sz w:val="20"/>
+          <w:szCs w:val="20"/>
+        </w:rPr>
+        <w:t>Składając poniższy podpis, potwierdzam że:</w:t>
+      </w:r>
+    </w:p>
+    <w:p>
+      <w:pPr>
+        <w:spacing w:after="60"/>
+      </w:pPr>
+      <w:r>
+        <w:rPr>
+          <w:rFonts w:ascii="Arial" w:hAnsi="Arial" w:cs="Arial"/>
           <w:b/>
           <w:bCs/>
+          <w:sz w:val="20"/>
+          <w:szCs w:val="20"/>
         </w:rPr>
         <w:t xml:space="preserve">1. </w:t>
       </w:r>
@@ -2472,20 +2038,20 @@
           <w:sz w:val="20"/>
           <w:szCs w:val="20"/>
         </w:rPr>
-        <w:t xml:space="preserve">Wszystkie podane przeze mnie dane są prawdziwe i aktualne.</w:t>
-      </w:r>
-    </w:p>
-    <w:p>
-      <w:pPr>
-        <w:spacing w:after="60" w:before="0"/>
-      </w:pPr>
-      <w:r>
-        <w:rPr>
-          <w:rFonts w:ascii="Arial" w:hAnsi="Arial" w:cs="Arial"/>
-          <w:sz w:val="20"/>
-          <w:szCs w:val="20"/>
+        <w:t>Wszystkie podane przeze mnie dane są prawdziwe i aktualne.</w:t>
+      </w:r>
+    </w:p>
+    <w:p>
+      <w:pPr>
+        <w:spacing w:after="60"/>
+      </w:pPr>
+      <w:r>
+        <w:rPr>
+          <w:rFonts w:ascii="Arial" w:hAnsi="Arial" w:cs="Arial"/>
           <w:b/>
           <w:bCs/>
+          <w:sz w:val="20"/>
+          <w:szCs w:val="20"/>
         </w:rPr>
         <w:t xml:space="preserve">2. </w:t>
       </w:r>
@@ -2495,20 +2061,20 @@
           <w:sz w:val="20"/>
           <w:szCs w:val="20"/>
         </w:rPr>
-        <w:t xml:space="preserve">Zapoznałem/am się z Regulaminem rekrutacji i uczestnictwa w projekcie.</w:t>
-      </w:r>
-    </w:p>
-    <w:p>
-      <w:pPr>
-        <w:spacing w:after="60" w:before="0"/>
-      </w:pPr>
-      <w:r>
-        <w:rPr>
-          <w:rFonts w:ascii="Arial" w:hAnsi="Arial" w:cs="Arial"/>
-          <w:sz w:val="20"/>
-          <w:szCs w:val="20"/>
+        <w:t>Zapoznałem/am się z Regulaminem rekrutacji i uczestnictwa w projekcie.</w:t>
+      </w:r>
+    </w:p>
+    <w:p>
+      <w:pPr>
+        <w:spacing w:after="60"/>
+      </w:pPr>
+      <w:r>
+        <w:rPr>
+          <w:rFonts w:ascii="Arial" w:hAnsi="Arial" w:cs="Arial"/>
           <w:b/>
           <w:bCs/>
+          <w:sz w:val="20"/>
+          <w:szCs w:val="20"/>
         </w:rPr>
         <w:t xml:space="preserve">3. </w:t>
       </w:r>
@@ -2518,20 +2084,20 @@
           <w:sz w:val="20"/>
           <w:szCs w:val="20"/>
         </w:rPr>
-        <w:t xml:space="preserve">Zapoznałem/am się z klauzulą informacyjną RODO (Sekcja E) i rozumiem zasady przetwarzania moich danych.</w:t>
-      </w:r>
-    </w:p>
-    <w:p>
-      <w:pPr>
-        <w:spacing w:after="60" w:before="0"/>
-      </w:pPr>
-      <w:r>
-        <w:rPr>
-          <w:rFonts w:ascii="Arial" w:hAnsi="Arial" w:cs="Arial"/>
-          <w:sz w:val="20"/>
-          <w:szCs w:val="20"/>
+        <w:t>Zapoznałem/am się z klauzulą informacyjną RODO (Sekcja E) i rozumiem zasady przetwarzania moich danych.</w:t>
+      </w:r>
+    </w:p>
+    <w:p>
+      <w:pPr>
+        <w:spacing w:after="60"/>
+      </w:pPr>
+      <w:r>
+        <w:rPr>
+          <w:rFonts w:ascii="Arial" w:hAnsi="Arial" w:cs="Arial"/>
           <w:b/>
           <w:bCs/>
+          <w:sz w:val="20"/>
+          <w:szCs w:val="20"/>
         </w:rPr>
         <w:t xml:space="preserve">4. </w:t>
       </w:r>
@@ -2541,20 +2107,20 @@
           <w:sz w:val="20"/>
           <w:szCs w:val="20"/>
         </w:rPr>
-        <w:t xml:space="preserve">Wyrażam zgody zaznaczone w Sekcji F.</w:t>
-      </w:r>
-    </w:p>
-    <w:p>
-      <w:pPr>
-        <w:spacing w:after="60" w:before="0"/>
-      </w:pPr>
-      <w:r>
-        <w:rPr>
-          <w:rFonts w:ascii="Arial" w:hAnsi="Arial" w:cs="Arial"/>
-          <w:sz w:val="20"/>
-          <w:szCs w:val="20"/>
+        <w:t>Wyrażam zgody zaznaczone w Sekcji F.</w:t>
+      </w:r>
+    </w:p>
+    <w:p>
+      <w:pPr>
+        <w:spacing w:after="60"/>
+      </w:pPr>
+      <w:r>
+        <w:rPr>
+          <w:rFonts w:ascii="Arial" w:hAnsi="Arial" w:cs="Arial"/>
           <w:b/>
           <w:bCs/>
+          <w:sz w:val="20"/>
+          <w:szCs w:val="20"/>
         </w:rPr>
         <w:t xml:space="preserve">5. </w:t>
       </w:r>
@@ -2564,20 +2130,20 @@
           <w:sz w:val="20"/>
           <w:szCs w:val="20"/>
         </w:rPr>
-        <w:t xml:space="preserve">Deklaruję udział w projekcie zgodnie z zobowiązaniami z Sekcji D.</w:t>
-      </w:r>
-    </w:p>
-    <w:p>
-      <w:pPr>
-        <w:spacing w:after="60" w:before="0"/>
-      </w:pPr>
-      <w:r>
-        <w:rPr>
-          <w:rFonts w:ascii="Arial" w:hAnsi="Arial" w:cs="Arial"/>
-          <w:sz w:val="20"/>
-          <w:szCs w:val="20"/>
+        <w:t>Deklaruję udział w projekcie zgodnie z zobowiązaniami z Sekcji D.</w:t>
+      </w:r>
+    </w:p>
+    <w:p>
+      <w:pPr>
+        <w:spacing w:after="60"/>
+      </w:pPr>
+      <w:r>
+        <w:rPr>
+          <w:rFonts w:ascii="Arial" w:hAnsi="Arial" w:cs="Arial"/>
           <w:b/>
           <w:bCs/>
+          <w:sz w:val="20"/>
+          <w:szCs w:val="20"/>
         </w:rPr>
         <w:t xml:space="preserve">6. </w:t>
       </w:r>
@@ -2587,7 +2153,7 @@
           <w:sz w:val="20"/>
           <w:szCs w:val="20"/>
         </w:rPr>
-        <w:t xml:space="preserve">Spełniam kryteria kwalifikowalności wymienione w Sekcji C.</w:t>
+        <w:t>Spełniam kryteria kwalifikowalności wymienione w Sekcji C.</w:t>
       </w:r>
     </w:p>
     <w:p>
@@ -2615,6 +2181,7 @@
           <w:right w:val="nil"/>
         </w:tblBorders>
         <w:tblLayout w:type="fixed"/>
+        <w:tblLook w:val="04A0" w:firstRow="1" w:lastRow="0" w:firstColumn="1" w:lastColumn="0" w:noHBand="0" w:noVBand="1"/>
       </w:tblPr>
       <w:tblGrid>
         <w:gridCol w:w="4536"/>
@@ -2633,26 +2200,26 @@
           </w:tcPr>
           <w:p>
             <w:pPr>
-              <w:spacing w:after="80" w:before="0"/>
+              <w:spacing w:after="80"/>
             </w:pPr>
             <w:r>
               <w:rPr>
                 <w:rFonts w:ascii="Arial" w:hAnsi="Arial" w:cs="Arial"/>
+                <w:b/>
+                <w:bCs/>
                 <w:sz w:val="20"/>
                 <w:szCs w:val="20"/>
-                <w:b/>
-                <w:bCs/>
               </w:rPr>
               <w:t xml:space="preserve">Miejscowość, data </w:t>
             </w:r>
             <w:r>
               <w:rPr>
                 <w:rFonts w:ascii="Arial" w:hAnsi="Arial" w:cs="Arial"/>
+                <w:color w:val="AAAAAA"/>
                 <w:sz w:val="20"/>
                 <w:szCs w:val="20"/>
-                <w:color w:val="AAAAAA"/>
               </w:rPr>
-              <w:t xml:space="preserve">..............................</w:t>
+              <w:t>..............................</w:t>
             </w:r>
           </w:p>
           <w:p>
@@ -2667,7 +2234,7 @@
           </w:p>
           <w:p>
             <w:pPr>
-              <w:spacing w:after="80" w:before="0"/>
+              <w:spacing w:after="80"/>
               <w:jc w:val="center"/>
             </w:pPr>
             <w:r>
@@ -2676,24 +2243,24 @@
                 <w:sz w:val="20"/>
                 <w:szCs w:val="20"/>
               </w:rPr>
-              <w:t xml:space="preserve">.......................................................</w:t>
+              <w:t>.......................................................</w:t>
             </w:r>
           </w:p>
           <w:p>
             <w:pPr>
-              <w:spacing w:after="80" w:before="0"/>
+              <w:spacing w:after="80"/>
               <w:jc w:val="center"/>
             </w:pPr>
             <w:r>
               <w:rPr>
                 <w:rFonts w:ascii="Arial" w:hAnsi="Arial" w:cs="Arial"/>
-                <w:sz w:val="16"/>
-                <w:szCs w:val="16"/>
                 <w:i/>
                 <w:iCs/>
                 <w:color w:val="666666"/>
+                <w:sz w:val="16"/>
+                <w:szCs w:val="16"/>
               </w:rPr>
-              <w:t xml:space="preserve">(czytelny podpis uczestnika/uczestniczki)</w:t>
+              <w:t>(czytelny podpis uczestnika/uczestniczki)</w:t>
             </w:r>
           </w:p>
         </w:tc>
@@ -2724,7 +2291,7 @@
           </w:p>
           <w:p>
             <w:pPr>
-              <w:spacing w:after="80" w:before="0"/>
+              <w:spacing w:after="80"/>
               <w:jc w:val="center"/>
             </w:pPr>
             <w:r>
@@ -2733,24 +2300,24 @@
                 <w:sz w:val="20"/>
                 <w:szCs w:val="20"/>
               </w:rPr>
-              <w:t xml:space="preserve">.......................................................</w:t>
+              <w:t>.......................................................</w:t>
             </w:r>
           </w:p>
           <w:p>
             <w:pPr>
-              <w:spacing w:after="80" w:before="0"/>
+              <w:spacing w:after="80"/>
               <w:jc w:val="center"/>
             </w:pPr>
             <w:r>
               <w:rPr>
                 <w:rFonts w:ascii="Arial" w:hAnsi="Arial" w:cs="Arial"/>
-                <w:sz w:val="16"/>
-                <w:szCs w:val="16"/>
                 <w:i/>
                 <w:iCs/>
                 <w:color w:val="666666"/>
+                <w:sz w:val="16"/>
+                <w:szCs w:val="16"/>
               </w:rPr>
-              <w:t xml:space="preserve">(podpis i pieczęć Koordynatora projektu)</w:t>
+              <w:t>(podpis i pieczęć Koordynatora projektu)</w:t>
             </w:r>
           </w:p>
         </w:tc>
@@ -2776,19 +2343,18 @@
       <w:r>
         <w:rPr>
           <w:rFonts w:ascii="Arial" w:hAnsi="Arial" w:cs="Arial"/>
-          <w:sz w:val="24"/>
-          <w:szCs w:val="24"/>
           <w:b/>
           <w:bCs/>
           <w:color w:val="2F5496"/>
         </w:rPr>
-        <w:t xml:space="preserve">ADNOTACJE BIURA PROJEKTU (wypełnia Koordynator)</w:t>
+        <w:t>ADNOTACJE BIURA PROJEKTU (wypełnia Koordynator)</w:t>
       </w:r>
     </w:p>
     <w:tbl>
       <w:tblPr>
         <w:tblW w:w="9072" w:type="dxa"/>
         <w:tblLayout w:type="fixed"/>
+        <w:tblLook w:val="04A0" w:firstRow="1" w:lastRow="0" w:firstColumn="1" w:lastColumn="0" w:noHBand="0" w:noVBand="1"/>
       </w:tblPr>
       <w:tblGrid>
         <w:gridCol w:w="3000"/>
@@ -2816,12 +2382,116 @@
             <w:r>
               <w:rPr>
                 <w:rFonts w:ascii="Arial" w:hAnsi="Arial" w:cs="Arial"/>
+                <w:b/>
+                <w:bCs/>
                 <w:sz w:val="20"/>
                 <w:szCs w:val="20"/>
+              </w:rPr>
+              <w:t>Data wpływu zgłoszenia</w:t>
+            </w:r>
+          </w:p>
+        </w:tc>
+        <w:tc>
+          <w:tcPr>
+            <w:tcW w:w="6072" w:type="dxa"/>
+            <w:tcBorders>
+              <w:top w:val="single" w:sz="4" w:space="0" w:color="999999"/>
+              <w:left w:val="single" w:sz="4" w:space="0" w:color="999999"/>
+              <w:bottom w:val="single" w:sz="4" w:space="0" w:color="999999"/>
+              <w:right w:val="single" w:sz="4" w:space="0" w:color="999999"/>
+            </w:tcBorders>
+            <w:tcMar>
+              <w:top w:w="60" w:type="dxa"/>
+              <w:left w:w="100" w:type="dxa"/>
+              <w:bottom w:w="60" w:type="dxa"/>
+              <w:right w:w="100" w:type="dxa"/>
+            </w:tcMar>
+          </w:tcPr>
+          <w:p>
+            <w:r>
+              <w:t>{{data_dzis}}</w:t>
+            </w:r>
+          </w:p>
+        </w:tc>
+      </w:tr>
+      <w:tr>
+        <w:tc>
+          <w:tcPr>
+            <w:tcW w:w="3000" w:type="dxa"/>
+            <w:tcBorders>
+              <w:top w:val="single" w:sz="4" w:space="0" w:color="999999"/>
+              <w:left w:val="single" w:sz="4" w:space="0" w:color="999999"/>
+              <w:bottom w:val="single" w:sz="4" w:space="0" w:color="999999"/>
+              <w:right w:val="single" w:sz="4" w:space="0" w:color="999999"/>
+            </w:tcBorders>
+            <w:shd w:val="clear" w:color="auto" w:fill="F2F2F2"/>
+            <w:tcMar>
+              <w:top w:w="60" w:type="dxa"/>
+              <w:left w:w="100" w:type="dxa"/>
+              <w:bottom w:w="60" w:type="dxa"/>
+              <w:right w:w="100" w:type="dxa"/>
+            </w:tcMar>
+          </w:tcPr>
+          <w:p>
+            <w:r>
+              <w:rPr>
+                <w:rFonts w:ascii="Arial" w:hAnsi="Arial" w:cs="Arial"/>
                 <w:b/>
                 <w:bCs/>
+                <w:sz w:val="20"/>
+                <w:szCs w:val="20"/>
               </w:rPr>
-              <w:t xml:space="preserve">Data wpływu zgłoszenia</w:t>
+              <w:t>Nr w rejestrze zgłoszeń</w:t>
+            </w:r>
+          </w:p>
+        </w:tc>
+        <w:tc>
+          <w:tcPr>
+            <w:tcW w:w="6072" w:type="dxa"/>
+            <w:tcBorders>
+              <w:top w:val="single" w:sz="4" w:space="0" w:color="999999"/>
+              <w:left w:val="single" w:sz="4" w:space="0" w:color="999999"/>
+              <w:bottom w:val="single" w:sz="4" w:space="0" w:color="999999"/>
+              <w:right w:val="single" w:sz="4" w:space="0" w:color="999999"/>
+            </w:tcBorders>
+            <w:tcMar>
+              <w:top w:w="60" w:type="dxa"/>
+              <w:left w:w="100" w:type="dxa"/>
+              <w:bottom w:w="60" w:type="dxa"/>
+              <w:right w:w="100" w:type="dxa"/>
+            </w:tcMar>
+          </w:tcPr>
+          <w:p/>
+        </w:tc>
+      </w:tr>
+      <w:tr>
+        <w:tc>
+          <w:tcPr>
+            <w:tcW w:w="3000" w:type="dxa"/>
+            <w:tcBorders>
+              <w:top w:val="single" w:sz="4" w:space="0" w:color="999999"/>
+              <w:left w:val="single" w:sz="4" w:space="0" w:color="999999"/>
+              <w:bottom w:val="single" w:sz="4" w:space="0" w:color="999999"/>
+              <w:right w:val="single" w:sz="4" w:space="0" w:color="999999"/>
+            </w:tcBorders>
+            <w:shd w:val="clear" w:color="auto" w:fill="F2F2F2"/>
+            <w:tcMar>
+              <w:top w:w="60" w:type="dxa"/>
+              <w:left w:w="100" w:type="dxa"/>
+              <w:bottom w:w="60" w:type="dxa"/>
+              <w:right w:w="100" w:type="dxa"/>
+            </w:tcMar>
+          </w:tcPr>
+          <w:p>
+            <w:r>
+              <w:rPr>
+                <w:rFonts w:ascii="Arial" w:hAnsi="Arial" w:cs="Arial"/>
+                <w:b/>
+                <w:bCs/>
+                <w:sz w:val="20"/>
+                <w:szCs w:val="20"/>
+              </w:rPr>
+              <w:t>Cykl rekrutacji</w:t>
             </w:r>
           </w:p>
         </w:tc>
@@ -2848,7 +2518,7 @@
                 <w:sz w:val="20"/>
                 <w:szCs w:val="20"/>
               </w:rPr>
-              <w:t xml:space="preserve"/>
+              <w:t>☐ I cykl (2026)     ☐ II cykl (2027)</w:t>
             </w:r>
           </w:p>
         </w:tc>
@@ -2875,12 +2545,12 @@
             <w:r>
               <w:rPr>
                 <w:rFonts w:ascii="Arial" w:hAnsi="Arial" w:cs="Arial"/>
+                <w:b/>
+                <w:bCs/>
                 <w:sz w:val="20"/>
                 <w:szCs w:val="20"/>
-                <w:b/>
-                <w:bCs/>
               </w:rPr>
-              <w:t xml:space="preserve">Nr w rejestrze zgłoszeń</w:t>
+              <w:t>Ocena formalna</w:t>
             </w:r>
           </w:p>
         </w:tc>
@@ -2907,7 +2577,7 @@
                 <w:sz w:val="20"/>
                 <w:szCs w:val="20"/>
               </w:rPr>
-              <w:t xml:space="preserve"/>
+              <w:t>☐ Pozytywna     ☐ Negatywna</w:t>
             </w:r>
           </w:p>
         </w:tc>
@@ -2934,12 +2604,12 @@
             <w:r>
               <w:rPr>
                 <w:rFonts w:ascii="Arial" w:hAnsi="Arial" w:cs="Arial"/>
+                <w:b/>
+                <w:bCs/>
                 <w:sz w:val="20"/>
                 <w:szCs w:val="20"/>
-                <w:b/>
-                <w:bCs/>
               </w:rPr>
-              <w:t xml:space="preserve">Cykl rekrutacji</w:t>
+              <w:t>Punkty rekrutacyjne</w:t>
             </w:r>
           </w:p>
         </w:tc>
@@ -2959,16 +2629,7 @@
               <w:right w:w="100" w:type="dxa"/>
             </w:tcMar>
           </w:tcPr>
-          <w:p>
-            <w:r>
-              <w:rPr>
-                <w:rFonts w:ascii="Arial" w:hAnsi="Arial" w:cs="Arial"/>
-                <w:sz w:val="20"/>
-                <w:szCs w:val="20"/>
-              </w:rPr>
-              <w:t xml:space="preserve">☐ I cykl (2026)     ☐ II cykl (2027)</w:t>
-            </w:r>
-          </w:p>
+          <w:p/>
         </w:tc>
       </w:tr>
       <w:tr>
@@ -2993,12 +2654,12 @@
             <w:r>
               <w:rPr>
                 <w:rFonts w:ascii="Arial" w:hAnsi="Arial" w:cs="Arial"/>
+                <w:b/>
+                <w:bCs/>
                 <w:sz w:val="20"/>
                 <w:szCs w:val="20"/>
-                <w:b/>
-                <w:bCs/>
               </w:rPr>
-              <w:t xml:space="preserve">Ocena formalna</w:t>
+              <w:t>Uwagi</w:t>
             </w:r>
           </w:p>
         </w:tc>
@@ -3018,134 +2679,7 @@
               <w:right w:w="100" w:type="dxa"/>
             </w:tcMar>
           </w:tcPr>
-          <w:p>
-            <w:r>
-              <w:rPr>
-                <w:rFonts w:ascii="Arial" w:hAnsi="Arial" w:cs="Arial"/>
-                <w:sz w:val="20"/>
-                <w:szCs w:val="20"/>
-              </w:rPr>
-              <w:t xml:space="preserve">☐ Pozytywna     ☐ Negatywna</w:t>
-            </w:r>
-          </w:p>
-        </w:tc>
-      </w:tr>
-      <w:tr>
-        <w:tc>
-          <w:tcPr>
-            <w:tcW w:w="3000" w:type="dxa"/>
-            <w:tcBorders>
-              <w:top w:val="single" w:sz="4" w:space="0" w:color="999999"/>
-              <w:left w:val="single" w:sz="4" w:space="0" w:color="999999"/>
-              <w:bottom w:val="single" w:sz="4" w:space="0" w:color="999999"/>
-              <w:right w:val="single" w:sz="4" w:space="0" w:color="999999"/>
-            </w:tcBorders>
-            <w:shd w:val="clear" w:color="auto" w:fill="F2F2F2"/>
-            <w:tcMar>
-              <w:top w:w="60" w:type="dxa"/>
-              <w:left w:w="100" w:type="dxa"/>
-              <w:bottom w:w="60" w:type="dxa"/>
-              <w:right w:w="100" w:type="dxa"/>
-            </w:tcMar>
-          </w:tcPr>
-          <w:p>
-            <w:r>
-              <w:rPr>
-                <w:rFonts w:ascii="Arial" w:hAnsi="Arial" w:cs="Arial"/>
-                <w:sz w:val="20"/>
-                <w:szCs w:val="20"/>
-                <w:b/>
-                <w:bCs/>
-              </w:rPr>
-              <w:t xml:space="preserve">Punkty rekrutacyjne</w:t>
-            </w:r>
-          </w:p>
-        </w:tc>
-        <w:tc>
-          <w:tcPr>
-            <w:tcW w:w="6072" w:type="dxa"/>
-            <w:tcBorders>
-              <w:top w:val="single" w:sz="4" w:space="0" w:color="999999"/>
-              <w:left w:val="single" w:sz="4" w:space="0" w:color="999999"/>
-              <w:bottom w:val="single" w:sz="4" w:space="0" w:color="999999"/>
-              <w:right w:val="single" w:sz="4" w:space="0" w:color="999999"/>
-            </w:tcBorders>
-            <w:tcMar>
-              <w:top w:w="60" w:type="dxa"/>
-              <w:left w:w="100" w:type="dxa"/>
-              <w:bottom w:w="60" w:type="dxa"/>
-              <w:right w:w="100" w:type="dxa"/>
-            </w:tcMar>
-          </w:tcPr>
-          <w:p>
-            <w:r>
-              <w:rPr>
-                <w:rFonts w:ascii="Arial" w:hAnsi="Arial" w:cs="Arial"/>
-                <w:sz w:val="20"/>
-                <w:szCs w:val="20"/>
-              </w:rPr>
-              <w:t xml:space="preserve"/>
-            </w:r>
-          </w:p>
-        </w:tc>
-      </w:tr>
-      <w:tr>
-        <w:tc>
-          <w:tcPr>
-            <w:tcW w:w="3000" w:type="dxa"/>
-            <w:tcBorders>
-              <w:top w:val="single" w:sz="4" w:space="0" w:color="999999"/>
-              <w:left w:val="single" w:sz="4" w:space="0" w:color="999999"/>
-              <w:bottom w:val="single" w:sz="4" w:space="0" w:color="999999"/>
-              <w:right w:val="single" w:sz="4" w:space="0" w:color="999999"/>
-            </w:tcBorders>
-            <w:shd w:val="clear" w:color="auto" w:fill="F2F2F2"/>
-            <w:tcMar>
-              <w:top w:w="60" w:type="dxa"/>
-              <w:left w:w="100" w:type="dxa"/>
-              <w:bottom w:w="60" w:type="dxa"/>
-              <w:right w:w="100" w:type="dxa"/>
-            </w:tcMar>
-          </w:tcPr>
-          <w:p>
-            <w:r>
-              <w:rPr>
-                <w:rFonts w:ascii="Arial" w:hAnsi="Arial" w:cs="Arial"/>
-                <w:sz w:val="20"/>
-                <w:szCs w:val="20"/>
-                <w:b/>
-                <w:bCs/>
-              </w:rPr>
-              <w:t xml:space="preserve">Uwagi</w:t>
-            </w:r>
-          </w:p>
-        </w:tc>
-        <w:tc>
-          <w:tcPr>
-            <w:tcW w:w="6072" w:type="dxa"/>
-            <w:tcBorders>
-              <w:top w:val="single" w:sz="4" w:space="0" w:color="999999"/>
-              <w:left w:val="single" w:sz="4" w:space="0" w:color="999999"/>
-              <w:bottom w:val="single" w:sz="4" w:space="0" w:color="999999"/>
-              <w:right w:val="single" w:sz="4" w:space="0" w:color="999999"/>
-            </w:tcBorders>
-            <w:tcMar>
-              <w:top w:w="60" w:type="dxa"/>
-              <w:left w:w="100" w:type="dxa"/>
-              <w:bottom w:w="60" w:type="dxa"/>
-              <w:right w:w="100" w:type="dxa"/>
-            </w:tcMar>
-          </w:tcPr>
-          <w:p>
-            <w:r>
-              <w:rPr>
-                <w:rFonts w:ascii="Arial" w:hAnsi="Arial" w:cs="Arial"/>
-                <w:sz w:val="20"/>
-                <w:szCs w:val="20"/>
-              </w:rPr>
-              <w:t xml:space="preserve"/>
-            </w:r>
-          </w:p>
+          <w:p/>
         </w:tc>
       </w:tr>
     </w:tbl>
@@ -3156,15 +2690,15 @@
     </w:p>
     <w:p>
       <w:pPr>
-        <w:spacing w:after="80" w:before="0"/>
-      </w:pPr>
-      <w:r>
-        <w:rPr>
-          <w:rFonts w:ascii="Arial" w:hAnsi="Arial" w:cs="Arial"/>
-          <w:sz w:val="20"/>
-          <w:szCs w:val="20"/>
-        </w:rPr>
-        <w:t xml:space="preserve">Podpis osoby przyjmującej zgłoszenie: .........................................................</w:t>
+        <w:spacing w:after="80"/>
+      </w:pPr>
+      <w:r>
+        <w:rPr>
+          <w:rFonts w:ascii="Arial" w:hAnsi="Arial" w:cs="Arial"/>
+          <w:sz w:val="20"/>
+          <w:szCs w:val="20"/>
+        </w:rPr>
+        <w:t>Podpis osoby przyjmującej zgłoszenie: .........................................................</w:t>
       </w:r>
     </w:p>
     <w:sectPr>
@@ -3241,7 +2775,7 @@
         <w:noProof/>
       </w:rPr>
       <w:drawing>
-        <wp:inline distT="0" distB="0" distL="0" distR="0" wp14:anchorId="72EC2907" wp14:editId="56D21602">
+        <wp:inline distT="0" distB="0" distL="0" distR="0" wp14:anchorId="48B25694" wp14:editId="7CB040CE">
           <wp:extent cx="5760720" cy="460375"/>
           <wp:effectExtent l="0" t="0" r="0" b="0"/>
           <wp:docPr id="147018804" name="Obraz 3"/>
@@ -3343,7 +2877,7 @@
         <w:noProof/>
       </w:rPr>
       <w:drawing>
-        <wp:inline distT="114300" distB="114300" distL="114300" distR="114300" wp14:anchorId="2B760997" wp14:editId="3B23C599">
+        <wp:inline distT="114300" distB="114300" distL="114300" distR="114300" wp14:anchorId="3BDDFBC1" wp14:editId="4E0FEFDB">
           <wp:extent cx="5461188" cy="838200"/>
           <wp:effectExtent l="0" t="0" r="0" b="0"/>
           <wp:docPr id="1032" name="image2.png"/>
@@ -3388,7 +2922,7 @@
         <w:noProof/>
       </w:rPr>
       <w:drawing>
-        <wp:inline distT="0" distB="0" distL="0" distR="0" wp14:anchorId="0B002001" wp14:editId="0B003001">
+        <wp:inline distT="0" distB="0" distL="0" distR="0" wp14:anchorId="54718F1B" wp14:editId="238BE3E4">
           <wp:extent cx="1524000" cy="654050"/>
           <wp:effectExtent l="0" t="0" r="0" b="0"/>
           <wp:docPr id="2001" name="logo_smartfon.png"/>

</xml_diff>

<commit_message>
A-01: stale zaznaczone Sekcja C i F + Inne potrzeby; wojewodztwo Lubuskie; usuniety email; Miejscowosc=Swiebodzin
</commit_message>
<xml_diff>
--- a/public/wzory/SWA_A-01_Pakiet_zgloszeniowy_uczestnika_szablon.docx
+++ b/public/wzory/SWA_A-01_Pakiet_zgloszeniowy_uczestnika_szablon.docx
@@ -686,7 +686,7 @@
           </w:tcPr>
           <w:p>
             <w:r>
-              <w:t>{{wojewodztwo}}</w:t>
+              <w:t>Lubuskie</w:t>
             </w:r>
           </w:p>
         </w:tc>
@@ -804,60 +804,6 @@
           </w:p>
         </w:tc>
       </w:tr>
-      <w:tr>
-        <w:tc>
-          <w:tcPr>
-            <w:tcW w:w="3000" w:type="dxa"/>
-            <w:tcBorders>
-              <w:top w:val="single" w:sz="4" w:space="0" w:color="999999"/>
-              <w:left w:val="single" w:sz="4" w:space="0" w:color="999999"/>
-              <w:bottom w:val="single" w:sz="4" w:space="0" w:color="999999"/>
-              <w:right w:val="single" w:sz="4" w:space="0" w:color="999999"/>
-            </w:tcBorders>
-            <w:shd w:val="clear" w:color="auto" w:fill="F2F2F2"/>
-            <w:tcMar>
-              <w:top w:w="60" w:type="dxa"/>
-              <w:left w:w="100" w:type="dxa"/>
-              <w:bottom w:w="60" w:type="dxa"/>
-              <w:right w:w="100" w:type="dxa"/>
-            </w:tcMar>
-          </w:tcPr>
-          <w:p>
-            <w:r>
-              <w:rPr>
-                <w:rFonts w:ascii="Arial" w:hAnsi="Arial" w:cs="Arial"/>
-                <w:b/>
-                <w:bCs/>
-                <w:sz w:val="20"/>
-                <w:szCs w:val="20"/>
-              </w:rPr>
-              <w:t>Adres e-mail</w:t>
-            </w:r>
-          </w:p>
-        </w:tc>
-        <w:tc>
-          <w:tcPr>
-            <w:tcW w:w="6072" w:type="dxa"/>
-            <w:tcBorders>
-              <w:top w:val="single" w:sz="4" w:space="0" w:color="999999"/>
-              <w:left w:val="single" w:sz="4" w:space="0" w:color="999999"/>
-              <w:bottom w:val="single" w:sz="4" w:space="0" w:color="999999"/>
-              <w:right w:val="single" w:sz="4" w:space="0" w:color="999999"/>
-            </w:tcBorders>
-            <w:tcMar>
-              <w:top w:w="60" w:type="dxa"/>
-              <w:left w:w="100" w:type="dxa"/>
-              <w:bottom w:w="60" w:type="dxa"/>
-              <w:right w:w="100" w:type="dxa"/>
-            </w:tcMar>
-          </w:tcPr>
-          <w:p>
-            <w:r>
-              <w:t>{{email}}</w:t>
-            </w:r>
-          </w:p>
-        </w:tc>
-      </w:tr>
     </w:tbl>
     <w:p>
       <w:pPr>
@@ -1183,7 +1129,7 @@
           <w:sz w:val="20"/>
           <w:szCs w:val="20"/>
         </w:rPr>
-        <w:t>☐  Inne potrzeby: posiadam stary smartfon i wnioskuję o możliwość otrzymania nowego modelu.</w:t>
+        <w:t>☒  Inne potrzeby: posiadam stary smartfon i wnioskuję o możliwość otrzymania nowego modelu.</w:t>
       </w:r>
     </w:p>
     <w:p>
@@ -1228,59 +1174,59 @@
           <w:sz w:val="20"/>
           <w:szCs w:val="20"/>
         </w:rPr>
-        <w:t>☐  Jestem osobą dorosłą (ukończone 18 lat).</w:t>
-      </w:r>
-    </w:p>
-    <w:p>
-      <w:pPr>
-        <w:spacing w:after="60"/>
-      </w:pPr>
-      <w:r>
-        <w:rPr>
-          <w:rFonts w:ascii="Arial" w:hAnsi="Arial" w:cs="Arial"/>
-          <w:sz w:val="20"/>
-          <w:szCs w:val="20"/>
-        </w:rPr>
-        <w:t>☐  Zamieszkuję / pracuję / przebywam na terenie województwa lubuskiego (w rozumieniu Kodeksu Cywilnego).</w:t>
-      </w:r>
-    </w:p>
-    <w:p>
-      <w:pPr>
-        <w:spacing w:after="60"/>
-      </w:pPr>
-      <w:r>
-        <w:rPr>
-          <w:rFonts w:ascii="Arial" w:hAnsi="Arial" w:cs="Arial"/>
-          <w:sz w:val="20"/>
-          <w:szCs w:val="20"/>
-        </w:rPr>
-        <w:t>☐  Nie uczestniczę w dalszym kształceniu w systemie oświaty (szkoła, studia).</w:t>
-      </w:r>
-    </w:p>
-    <w:p>
-      <w:pPr>
-        <w:spacing w:after="60"/>
-      </w:pPr>
-      <w:r>
-        <w:rPr>
-          <w:rFonts w:ascii="Arial" w:hAnsi="Arial" w:cs="Arial"/>
-          <w:sz w:val="20"/>
-          <w:szCs w:val="20"/>
-        </w:rPr>
-        <w:t>☐  Nie prowadzę działalności gospodarczej ani oświatowej.</w:t>
-      </w:r>
-    </w:p>
-    <w:p>
-      <w:pPr>
-        <w:spacing w:after="60"/>
-      </w:pPr>
-      <w:r>
-        <w:rPr>
-          <w:rFonts w:ascii="Arial" w:hAnsi="Arial" w:cs="Arial"/>
-          <w:sz w:val="20"/>
-          <w:szCs w:val="20"/>
-        </w:rPr>
-        <w:t>☐  Z własnej woli zgłaszam chęć podnoszenia lub uzupełniania umiejętności podstawowych (rozumienie informacji, rozumowanie matematyczne, umiejętności cyfrowe).</w:t>
+        <w:t>☒  Jestem osobą dorosłą (ukończone 18 lat).</w:t>
+      </w:r>
+    </w:p>
+    <w:p>
+      <w:pPr>
+        <w:spacing w:after="60"/>
+      </w:pPr>
+      <w:r>
+        <w:rPr>
+          <w:rFonts w:ascii="Arial" w:hAnsi="Arial" w:cs="Arial"/>
+          <w:sz w:val="20"/>
+          <w:szCs w:val="20"/>
+        </w:rPr>
+        <w:t>☒  Zamieszkuję / pracuję / przebywam na terenie województwa lubuskiego (w rozumieniu Kodeksu Cywilnego).</w:t>
+      </w:r>
+    </w:p>
+    <w:p>
+      <w:pPr>
+        <w:spacing w:after="60"/>
+      </w:pPr>
+      <w:r>
+        <w:rPr>
+          <w:rFonts w:ascii="Arial" w:hAnsi="Arial" w:cs="Arial"/>
+          <w:sz w:val="20"/>
+          <w:szCs w:val="20"/>
+        </w:rPr>
+        <w:t>☒  Nie uczestniczę w dalszym kształceniu w systemie oświaty (szkoła, studia).</w:t>
+      </w:r>
+    </w:p>
+    <w:p>
+      <w:pPr>
+        <w:spacing w:after="60"/>
+      </w:pPr>
+      <w:r>
+        <w:rPr>
+          <w:rFonts w:ascii="Arial" w:hAnsi="Arial" w:cs="Arial"/>
+          <w:sz w:val="20"/>
+          <w:szCs w:val="20"/>
+        </w:rPr>
+        <w:t>☒  Nie prowadzę działalności gospodarczej ani oświatowej.</w:t>
+      </w:r>
+    </w:p>
+    <w:p>
+      <w:pPr>
+        <w:spacing w:after="60"/>
+      </w:pPr>
+      <w:r>
+        <w:rPr>
+          <w:rFonts w:ascii="Arial" w:hAnsi="Arial" w:cs="Arial"/>
+          <w:sz w:val="20"/>
+          <w:szCs w:val="20"/>
+        </w:rPr>
+        <w:t>☒  Z własnej woli zgłaszam chęć podnoszenia lub uzupełniania umiejętności podstawowych (rozumienie informacji, rozumowanie matematyczne, umiejętności cyfrowe).</w:t>
       </w:r>
     </w:p>
     <w:p>
@@ -1685,7 +1631,7 @@
           <w:sz w:val="20"/>
           <w:szCs w:val="20"/>
         </w:rPr>
-        <w:t>☐  Wyrażam zgodę na przetwarzanie moich danych osobowych zawartych w niniejszym formularzu w zakresie niezbędnym do realizacji projektu, zgodnie z klauzulą informacyjną (Sekcja E).</w:t>
+        <w:t>☒  Wyrażam zgodę na przetwarzanie moich danych osobowych zawartych w niniejszym formularzu w zakresie niezbędnym do realizacji projektu, zgodnie z klauzulą informacyjną (Sekcja E).</w:t>
       </w:r>
     </w:p>
     <w:p>
@@ -1703,7 +1649,7 @@
           <w:sz w:val="20"/>
           <w:szCs w:val="20"/>
         </w:rPr>
-        <w:t>☐  Wyrażam zgodę na przetwarzanie moich danych osobowych w zakresie określonym w załączniku nr 4 do umowy o dofinansowanie (zakres danych nt. uczestników projektu) oraz na przekazanie danych do systemu CST2021.</w:t>
+        <w:t>☒  Wyrażam zgodę na przetwarzanie moich danych osobowych w zakresie określonym w załączniku nr 4 do umowy o dofinansowanie (zakres danych nt. uczestników projektu) oraz na przekazanie danych do systemu CST2021.</w:t>
       </w:r>
     </w:p>
     <w:p>
@@ -1721,8 +1667,7 @@
           <w:sz w:val="20"/>
           <w:szCs w:val="20"/>
         </w:rPr>
-        <w:lastRenderedPageBreak/>
-        <w:t>☐  Wyrażam zgodę na nieodpłatne wykorzystanie mojego wizerunku (zdjęcia, nagrania) utrwalonego podczas udziału w projekcie, w celach informacyjnych i promocyjnych projektu, w tym na stronie www, mediach społecznościowych i materiałach drukowanych.</w:t>
+        <w:t>☒  Wyrażam zgodę na nieodpłatne wykorzystanie mojego wizerunku (zdjęcia, nagrania) utrwalonego podczas udziału w projekcie, w celach informacyjnych i promocyjnych projektu, w tym na stronie www, mediach społecznościowych i materiałach drukowanych.</w:t>
       </w:r>
     </w:p>
     <w:p>
@@ -1757,7 +1702,7 @@
           <w:sz w:val="20"/>
           <w:szCs w:val="20"/>
         </w:rPr>
-        <w:t>☐  Wyrażam zgodę na kontakt telefoniczny i mailowy w sprawach związanych z realizacją projektu oraz informowania o przyszłych działaniach edukacyjnych Stowarzyszenia.</w:t>
+        <w:t>☒  Wyrażam zgodę na kontakt telefoniczny i mailowy w sprawach związanych z realizacją projektu oraz informowania o przyszłych działaniach edukacyjnych Stowarzyszenia.</w:t>
       </w:r>
     </w:p>
     <w:p>
@@ -2210,7 +2155,7 @@
                 <w:sz w:val="20"/>
                 <w:szCs w:val="20"/>
               </w:rPr>
-              <w:t xml:space="preserve">Miejscowość, data </w:t>
+              <w:t>Miejscowość, data: Świebodzin, {{data_dzis}}</w:t>
             </w:r>
             <w:r>
               <w:rPr>
@@ -2219,7 +2164,6 @@
                 <w:sz w:val="20"/>
                 <w:szCs w:val="20"/>
               </w:rPr>
-              <w:t>..............................</w:t>
             </w:r>
           </w:p>
           <w:p>
@@ -2407,11 +2351,7 @@
               <w:right w:w="100" w:type="dxa"/>
             </w:tcMar>
           </w:tcPr>
-          <w:p>
-            <w:r>
-              <w:t>{{data_dzis}}</w:t>
-            </w:r>
-          </w:p>
+          <w:p/>
         </w:tc>
       </w:tr>
       <w:tr>

</xml_diff>

<commit_message>
A-01: usuniety wiersz 'Nr w rejestrze zgloszen' (nie numerujemy rejestru)
</commit_message>
<xml_diff>
--- a/public/wzory/SWA_A-01_Pakiet_zgloszeniowy_uczestnika_szablon.docx
+++ b/public/wzory/SWA_A-01_Pakiet_zgloszeniowy_uczestnika_szablon.docx
@@ -2332,56 +2332,6 @@
                 <w:szCs w:val="20"/>
               </w:rPr>
               <w:t>Data wpływu zgłoszenia</w:t>
-            </w:r>
-          </w:p>
-        </w:tc>
-        <w:tc>
-          <w:tcPr>
-            <w:tcW w:w="6072" w:type="dxa"/>
-            <w:tcBorders>
-              <w:top w:val="single" w:sz="4" w:space="0" w:color="999999"/>
-              <w:left w:val="single" w:sz="4" w:space="0" w:color="999999"/>
-              <w:bottom w:val="single" w:sz="4" w:space="0" w:color="999999"/>
-              <w:right w:val="single" w:sz="4" w:space="0" w:color="999999"/>
-            </w:tcBorders>
-            <w:tcMar>
-              <w:top w:w="60" w:type="dxa"/>
-              <w:left w:w="100" w:type="dxa"/>
-              <w:bottom w:w="60" w:type="dxa"/>
-              <w:right w:w="100" w:type="dxa"/>
-            </w:tcMar>
-          </w:tcPr>
-          <w:p/>
-        </w:tc>
-      </w:tr>
-      <w:tr>
-        <w:tc>
-          <w:tcPr>
-            <w:tcW w:w="3000" w:type="dxa"/>
-            <w:tcBorders>
-              <w:top w:val="single" w:sz="4" w:space="0" w:color="999999"/>
-              <w:left w:val="single" w:sz="4" w:space="0" w:color="999999"/>
-              <w:bottom w:val="single" w:sz="4" w:space="0" w:color="999999"/>
-              <w:right w:val="single" w:sz="4" w:space="0" w:color="999999"/>
-            </w:tcBorders>
-            <w:shd w:val="clear" w:color="auto" w:fill="F2F2F2"/>
-            <w:tcMar>
-              <w:top w:w="60" w:type="dxa"/>
-              <w:left w:w="100" w:type="dxa"/>
-              <w:bottom w:w="60" w:type="dxa"/>
-              <w:right w:w="100" w:type="dxa"/>
-            </w:tcMar>
-          </w:tcPr>
-          <w:p>
-            <w:r>
-              <w:rPr>
-                <w:rFonts w:ascii="Arial" w:hAnsi="Arial" w:cs="Arial"/>
-                <w:b/>
-                <w:bCs/>
-                <w:sz w:val="20"/>
-                <w:szCs w:val="20"/>
-              </w:rPr>
-              <w:t>Nr w rejestrze zgłoszeń</w:t>
             </w:r>
           </w:p>
         </w:tc>

</xml_diff>

<commit_message>
Popraw formularze uczestnikow SWA
</commit_message>
<xml_diff>
--- a/public/wzory/SWA_A-01_Pakiet_zgloszeniowy_uczestnika_szablon.docx
+++ b/public/wzory/SWA_A-01_Pakiet_zgloszeniowy_uczestnika_szablon.docx
@@ -376,7 +376,7 @@
                 <w:sz w:val="20"/>
                 <w:szCs w:val="20"/>
               </w:rPr>
-              <w:t>☐ Kobieta     ☐ Mężczyzna</w:t>
+              <w:t>{{cb_kobieta}} Kobieta     {{cb_mezczyzna}} Mężczyzna</w:t>
             </w:r>
           </w:p>
         </w:tc>
@@ -745,7 +745,7 @@
                 <w:sz w:val="20"/>
                 <w:szCs w:val="20"/>
               </w:rPr>
-              <w:t>☐ Miasto     ☐ Wieś / teren wiejski</w:t>
+              <w:t>{{cb_miasto}} Miasto     {{cb_wies}} Wieś / teren wiejski</w:t>
             </w:r>
           </w:p>
         </w:tc>
@@ -847,59 +847,59 @@
           <w:sz w:val="20"/>
           <w:szCs w:val="20"/>
         </w:rPr>
-        <w:t>☐  Osoba pracująca</w:t>
-      </w:r>
-    </w:p>
-    <w:p>
-      <w:pPr>
-        <w:spacing w:after="60"/>
-      </w:pPr>
-      <w:r>
-        <w:rPr>
-          <w:rFonts w:ascii="Arial" w:hAnsi="Arial" w:cs="Arial"/>
-          <w:sz w:val="20"/>
-          <w:szCs w:val="20"/>
-        </w:rPr>
-        <w:t>☐  Osoba bezrobotna (zarejestrowana w PUP)</w:t>
-      </w:r>
-    </w:p>
-    <w:p>
-      <w:pPr>
-        <w:spacing w:after="60"/>
-      </w:pPr>
-      <w:r>
-        <w:rPr>
-          <w:rFonts w:ascii="Arial" w:hAnsi="Arial" w:cs="Arial"/>
-          <w:sz w:val="20"/>
-          <w:szCs w:val="20"/>
-        </w:rPr>
-        <w:t>☐  Osoba bezrobotna (niezarejestrowana)</w:t>
-      </w:r>
-    </w:p>
-    <w:p>
-      <w:pPr>
-        <w:spacing w:after="60"/>
-      </w:pPr>
-      <w:r>
-        <w:rPr>
-          <w:rFonts w:ascii="Arial" w:hAnsi="Arial" w:cs="Arial"/>
-          <w:sz w:val="20"/>
-          <w:szCs w:val="20"/>
-        </w:rPr>
-        <w:t>☐  Osoba bierna zawodowo</w:t>
-      </w:r>
-    </w:p>
-    <w:p>
-      <w:pPr>
-        <w:spacing w:after="60"/>
-      </w:pPr>
-      <w:r>
-        <w:rPr>
-          <w:rFonts w:ascii="Arial" w:hAnsi="Arial" w:cs="Arial"/>
-          <w:sz w:val="20"/>
-          <w:szCs w:val="20"/>
-        </w:rPr>
-        <w:t>☐  Emeryt/rencista</w:t>
+        <w:t>{{cb_swa_pracujaca}} Osoba pracująca</w:t>
+      </w:r>
+    </w:p>
+    <w:p>
+      <w:pPr>
+        <w:spacing w:after="60"/>
+      </w:pPr>
+      <w:r>
+        <w:rPr>
+          <w:rFonts w:ascii="Arial" w:hAnsi="Arial" w:cs="Arial"/>
+          <w:sz w:val="20"/>
+          <w:szCs w:val="20"/>
+        </w:rPr>
+        <w:t>{{cb_swa_bezrob_zarej}} Osoba bezrobotna (zarejestrowana w PUP)</w:t>
+      </w:r>
+    </w:p>
+    <w:p>
+      <w:pPr>
+        <w:spacing w:after="60"/>
+      </w:pPr>
+      <w:r>
+        <w:rPr>
+          <w:rFonts w:ascii="Arial" w:hAnsi="Arial" w:cs="Arial"/>
+          <w:sz w:val="20"/>
+          <w:szCs w:val="20"/>
+        </w:rPr>
+        <w:t>{{cb_swa_bezrob_niezarej}} Osoba bezrobotna (niezarejestrowana)</w:t>
+      </w:r>
+    </w:p>
+    <w:p>
+      <w:pPr>
+        <w:spacing w:after="60"/>
+      </w:pPr>
+      <w:r>
+        <w:rPr>
+          <w:rFonts w:ascii="Arial" w:hAnsi="Arial" w:cs="Arial"/>
+          <w:sz w:val="20"/>
+          <w:szCs w:val="20"/>
+        </w:rPr>
+        <w:t>{{cb_swa_bierna}} Osoba bierna zawodowo</w:t>
+      </w:r>
+    </w:p>
+    <w:p>
+      <w:pPr>
+        <w:spacing w:after="60"/>
+      </w:pPr>
+      <w:r>
+        <w:rPr>
+          <w:rFonts w:ascii="Arial" w:hAnsi="Arial" w:cs="Arial"/>
+          <w:sz w:val="20"/>
+          <w:szCs w:val="20"/>
+        </w:rPr>
+        <w:t>{{cb_swa_emeryt_rencista}} Emeryt/rencista</w:t>
       </w:r>
     </w:p>
     <w:p>
@@ -933,59 +933,59 @@
           <w:szCs w:val="20"/>
         </w:rPr>
         <w:lastRenderedPageBreak/>
-        <w:t>☐  Podstawowe</w:t>
-      </w:r>
-    </w:p>
-    <w:p>
-      <w:pPr>
-        <w:spacing w:after="60"/>
-      </w:pPr>
-      <w:r>
-        <w:rPr>
-          <w:rFonts w:ascii="Arial" w:hAnsi="Arial" w:cs="Arial"/>
-          <w:sz w:val="20"/>
-          <w:szCs w:val="20"/>
-        </w:rPr>
-        <w:t>☐  Gimnazjalne</w:t>
-      </w:r>
-    </w:p>
-    <w:p>
-      <w:pPr>
-        <w:spacing w:after="60"/>
-      </w:pPr>
-      <w:r>
-        <w:rPr>
-          <w:rFonts w:ascii="Arial" w:hAnsi="Arial" w:cs="Arial"/>
-          <w:sz w:val="20"/>
-          <w:szCs w:val="20"/>
-        </w:rPr>
-        <w:t>☐  Ponadgimnazjalne / średnie</w:t>
-      </w:r>
-    </w:p>
-    <w:p>
-      <w:pPr>
-        <w:spacing w:after="60"/>
-      </w:pPr>
-      <w:r>
-        <w:rPr>
-          <w:rFonts w:ascii="Arial" w:hAnsi="Arial" w:cs="Arial"/>
-          <w:sz w:val="20"/>
-          <w:szCs w:val="20"/>
-        </w:rPr>
-        <w:t>☐  Policealne</w:t>
-      </w:r>
-    </w:p>
-    <w:p>
-      <w:pPr>
-        <w:spacing w:after="60"/>
-      </w:pPr>
-      <w:r>
-        <w:rPr>
-          <w:rFonts w:ascii="Arial" w:hAnsi="Arial" w:cs="Arial"/>
-          <w:sz w:val="20"/>
-          <w:szCs w:val="20"/>
-        </w:rPr>
-        <w:t>☐  Wyższe</w:t>
+        <w:t>{{cb_swa_wyk_podstawowe}} Podstawowe</w:t>
+      </w:r>
+    </w:p>
+    <w:p>
+      <w:pPr>
+        <w:spacing w:after="60"/>
+      </w:pPr>
+      <w:r>
+        <w:rPr>
+          <w:rFonts w:ascii="Arial" w:hAnsi="Arial" w:cs="Arial"/>
+          <w:sz w:val="20"/>
+          <w:szCs w:val="20"/>
+        </w:rPr>
+        <w:t>{{cb_swa_wyk_gimnazjalne}} Gimnazjalne</w:t>
+      </w:r>
+    </w:p>
+    <w:p>
+      <w:pPr>
+        <w:spacing w:after="60"/>
+      </w:pPr>
+      <w:r>
+        <w:rPr>
+          <w:rFonts w:ascii="Arial" w:hAnsi="Arial" w:cs="Arial"/>
+          <w:sz w:val="20"/>
+          <w:szCs w:val="20"/>
+        </w:rPr>
+        <w:t>{{cb_swa_wyk_srednie}} Ponadgimnazjalne / średnie</w:t>
+      </w:r>
+    </w:p>
+    <w:p>
+      <w:pPr>
+        <w:spacing w:after="60"/>
+      </w:pPr>
+      <w:r>
+        <w:rPr>
+          <w:rFonts w:ascii="Arial" w:hAnsi="Arial" w:cs="Arial"/>
+          <w:sz w:val="20"/>
+          <w:szCs w:val="20"/>
+        </w:rPr>
+        <w:t>{{cb_swa_wyk_policealne}} Policealne</w:t>
+      </w:r>
+    </w:p>
+    <w:p>
+      <w:pPr>
+        <w:spacing w:after="60"/>
+      </w:pPr>
+      <w:r>
+        <w:rPr>
+          <w:rFonts w:ascii="Arial" w:hAnsi="Arial" w:cs="Arial"/>
+          <w:sz w:val="20"/>
+          <w:szCs w:val="20"/>
+        </w:rPr>
+        <w:t>{{cb_swa_wyk_wyzsze}} Wyższe</w:t>
       </w:r>
     </w:p>
     <w:p>
@@ -1018,20 +1018,20 @@
           <w:sz w:val="20"/>
           <w:szCs w:val="20"/>
         </w:rPr>
-        <w:t>☐  NIE – nie posiadam orzeczenia o niepełnosprawności</w:t>
-      </w:r>
-    </w:p>
-    <w:p>
-      <w:pPr>
-        <w:spacing w:after="60"/>
-      </w:pPr>
-      <w:r>
-        <w:rPr>
-          <w:rFonts w:ascii="Arial" w:hAnsi="Arial" w:cs="Arial"/>
-          <w:sz w:val="20"/>
-          <w:szCs w:val="20"/>
-        </w:rPr>
-        <w:t>☐  TAK – posiadam orzeczenie o niepełnosprawności (rodzaj: ..........................................)</w:t>
+        <w:t>{{cb_swa_niepelnosprawnosc_nie}} NIE – nie posiadam orzeczenia o niepełnosprawności</w:t>
+      </w:r>
+    </w:p>
+    <w:p>
+      <w:pPr>
+        <w:spacing w:after="60"/>
+      </w:pPr>
+      <w:r>
+        <w:rPr>
+          <w:rFonts w:ascii="Arial" w:hAnsi="Arial" w:cs="Arial"/>
+          <w:sz w:val="20"/>
+          <w:szCs w:val="20"/>
+        </w:rPr>
+        <w:t>{{cb_swa_niepelnosprawnosc_tak}} TAK – posiadam orzeczenie o niepełnosprawności (rodzaj: ..........................................)</w:t>
       </w:r>
     </w:p>
     <w:p>
@@ -2408,7 +2408,7 @@
                 <w:sz w:val="20"/>
                 <w:szCs w:val="20"/>
               </w:rPr>
-              <w:t>☐ I cykl (2026)     ☐ II cykl (2027)</w:t>
+              <w:t>{{cb_swa_cykl1}} I cykl (2026)     {{cb_swa_cykl2}} II cykl (2027)</w:t>
             </w:r>
           </w:p>
         </w:tc>

</xml_diff>